<commit_message>
Fix admissibility and consistency proof of the heuristic function.
</commit_message>
<xml_diff>
--- a/گزارش پروژه اول.docx
+++ b/گزارش پروژه اول.docx
@@ -725,19 +725,7 @@
         <w:rPr>
           <w:rtl/>
         </w:rPr>
-        <w:t>از نادیده‌گرفتن پدها در معیار فاصله</w:t>
-      </w:r>
-      <w:r>
-        <w:rPr>
-          <w:rtl/>
-        </w:rPr>
-        <w:t xml:space="preserve"> </w:t>
-      </w:r>
-      <w:r>
-        <w:rPr>
-          <w:rtl/>
-        </w:rPr>
-        <w:t>ناشی می‌شد</w:t>
+        <w:t>از نادیده‌گرفتن پدها در معیار فاصله ناشی می‌شد</w:t>
       </w:r>
       <w:r>
         <w:rPr>
@@ -751,11 +739,6 @@
           <w:rtl/>
         </w:rPr>
         <w:br/>
-      </w:r>
-      <w:r>
-        <w:rPr>
-          <w:rtl/>
-        </w:rPr>
         <w:t>تابع فاصله‌ی منهتن</w:t>
       </w:r>
       <w:r>
@@ -773,298 +756,108 @@
       </w:r>
     </w:p>
     <w:p>
-      <w:pPr>
-        <w:rPr>
-          <w:rtl/>
-        </w:rPr>
-      </w:pPr>
-      <w:r>
-        <w:rPr>
-          <w:rFonts w:eastAsiaTheme="minorEastAsia" w:hint="cs"/>
-          <w:rtl/>
-        </w:rPr>
-        <w:t>برای رفع این مشکل</w:t>
-      </w:r>
-      <w:r>
-        <w:rPr>
-          <w:rFonts w:eastAsiaTheme="minorEastAsia" w:hint="cs"/>
-          <w:rtl/>
-        </w:rPr>
-        <w:t xml:space="preserve">، </w:t>
-      </w:r>
-      <w:r>
-        <w:rPr>
-          <w:rFonts w:eastAsiaTheme="minorEastAsia"/>
-          <w:rtl/>
-        </w:rPr>
-        <w:t xml:space="preserve">در ابتدای بازی یک‌بار جدول کوتاه‌ترین مسیر بین همه‌ی خانه‌های قابل‌عبور نقشه با الگوریتم </w:t>
-      </w:r>
-      <w:r>
-        <w:rPr>
-          <w:rFonts w:eastAsiaTheme="minorEastAsia"/>
-        </w:rPr>
+      <w:r>
+        <w:rPr>
+          <w:rtl/>
+          <w:lang w:bidi="ar-SA"/>
+        </w:rPr>
+        <w:t xml:space="preserve">برای رفع این مشکل، در ابتدای بازی یک‌بار جدول کوتاه‌ترین مسیر بین همه‌ی خانه‌های قابل‌عبور نقشه با الگوریتم </w:t>
+      </w:r>
+      <w:r>
         <w:t>Dijkstra</w:t>
       </w:r>
       <w:r>
         <w:rPr>
-          <w:rFonts w:eastAsiaTheme="minorEastAsia"/>
-          <w:rtl/>
-        </w:rPr>
-        <w:t xml:space="preserve"> ساخته و ذخیره می‌شود</w:t>
-      </w:r>
-      <w:r>
-        <w:rPr>
-          <w:rFonts w:eastAsiaTheme="minorEastAsia" w:hint="cs"/>
-          <w:rtl/>
-        </w:rPr>
-        <w:t xml:space="preserve">. </w:t>
-      </w:r>
-      <w:r>
-        <w:rPr>
-          <w:rtl/>
-        </w:rPr>
-        <w:t xml:space="preserve">این جدول قوانین واقعی حرکت </w:t>
-      </w:r>
-      <w:r>
-        <w:rPr>
-          <w:rFonts w:hint="cs"/>
-          <w:rtl/>
-        </w:rPr>
-        <w:t xml:space="preserve">شامل </w:t>
-      </w:r>
-      <w:r>
-        <w:rPr>
-          <w:rtl/>
-        </w:rPr>
-        <w:t>دیوار، هزینه‌ی زمین</w:t>
-      </w:r>
-      <w:r>
-        <w:rPr>
-          <w:rFonts w:hint="cs"/>
-          <w:rtl/>
-        </w:rPr>
-        <w:t xml:space="preserve"> و </w:t>
-      </w:r>
-      <w:r>
-        <w:rPr>
-          <w:rtl/>
-        </w:rPr>
-        <w:t xml:space="preserve">تله‌پورت پد را پیاده می‌کند؛ فقط دشمن‌ها و توالی زمانی از آن حذف شده‌اند </w:t>
-      </w:r>
-      <w:r>
-        <w:rPr>
-          <w:rFonts w:hint="cs"/>
-          <w:rtl/>
-        </w:rPr>
-        <w:t xml:space="preserve">که </w:t>
-      </w:r>
-      <w:r>
-        <w:rPr>
-          <w:rtl/>
-        </w:rPr>
-        <w:t>چون این حذف فقط محدودیت را کم می‌کند و میان‌بر تازه‌ای اضافه نمی‌کند، هر عدد این جدول کوچک‌تر یا مساوی هزینه‌ی واقعی حرکت بین آن دو خانه است.</w:t>
+          <w:rtl/>
+          <w:lang w:bidi="ar-SA"/>
+        </w:rPr>
+        <w:t xml:space="preserve"> ساخته و ذخیره می‌شود. این جدول قوانین واقعی حرکت شامل دیوار، هزینه‌ی زمین و تله‌پورت پد را پیاده می‌کند؛ فقط دشمن‌ها و توالی زمانی از آن حذف شده‌اند که چون این حذف فقط محدودیت را کم می‌کند و میان‌بر تازه‌ای اضافه نمی‌کند، هر عدد این جدول کوچک‌تر یا مساوی هزینه‌ی واقعی حرکت بین آن دو خانه است.</w:t>
       </w:r>
     </w:p>
     <w:p>
       <w:pPr>
         <w:rPr>
           <w:rtl/>
-        </w:rPr>
-      </w:pPr>
-      <w:r>
-        <w:rPr>
-          <w:rFonts w:hint="cs"/>
-          <w:rtl/>
+          <w:lang w:bidi="ar-SA"/>
+        </w:rPr>
+      </w:pPr>
+      <w:r>
+        <w:rPr>
+          <w:rtl/>
+          <w:lang w:bidi="ar-SA"/>
         </w:rPr>
         <w:lastRenderedPageBreak/>
-        <w:t xml:space="preserve">سپس باتوجه به کم بودن اهداف باقی مانده، </w:t>
-      </w:r>
-      <w:r>
-        <w:rPr>
-          <w:rtl/>
-        </w:rPr>
-        <w:t>به‌جای حدس‌زدن یک ترتیب، با برنامه‌نویسی پویا روی زیرمجموعه‌ها</w:t>
-      </w:r>
-      <w:r>
-        <w:rPr>
-          <w:rFonts w:hint="cs"/>
-          <w:rtl/>
-        </w:rPr>
-        <w:t xml:space="preserve"> </w:t>
-      </w:r>
-      <w:r>
-        <w:rPr>
-          <w:rtl/>
-        </w:rPr>
-        <w:t xml:space="preserve">بهترین ترتیب ممکن به‌طور دقیق پیدا می‌شود. یک نکته‌ی دامنه هم در این DP اعمال شده: یک </w:t>
-      </w:r>
-      <w:r>
-        <w:t>raft</w:t>
-      </w:r>
-      <w:r>
-        <w:rPr>
-          <w:rtl/>
-        </w:rPr>
-        <w:t xml:space="preserve"> فقط زمانی به‌عنوان ایستگاه بعدی مجاز</w:t>
-      </w:r>
-      <w:r>
-        <w:t xml:space="preserve"> </w:t>
-      </w:r>
-      <w:r>
-        <w:rPr>
-          <w:rtl/>
-        </w:rPr>
-        <w:t>در نظر گرفته می‌شود که تعداد فرگمنت جمع‌شده در همان ترتیب</w:t>
-      </w:r>
-      <w:r>
-        <w:t xml:space="preserve"> </w:t>
-      </w:r>
-      <w:r>
-        <w:rPr>
-          <w:rtl/>
-        </w:rPr>
-        <w:t xml:space="preserve">خاص، شرط آن </w:t>
-      </w:r>
-      <w:r>
-        <w:t>raft</w:t>
-      </w:r>
-      <w:r>
-        <w:rPr>
-          <w:rFonts w:hint="cs"/>
-          <w:rtl/>
-        </w:rPr>
-        <w:t xml:space="preserve"> </w:t>
-      </w:r>
-      <w:r>
-        <w:rPr>
-          <w:rtl/>
-        </w:rPr>
-        <w:t xml:space="preserve">را برآورده کند. این تنگ‌ترکردن باعث </w:t>
+        <w:t xml:space="preserve">سپس باتوجه به کم بودن اهداف باقی‌مانده، به‌جای حدس‌زدن یک ترتیب، با برنامه‌نویسی پویا روی زیرمجموعه‌ها بهترین ترتیب ممکن به‌طور دقیق پیدا می‌شود. یک نکته‌ی دامنه هم در این </w:t>
+      </w:r>
+      <w:r>
+        <w:t>DP</w:t>
+      </w:r>
+      <w:r>
+        <w:rPr>
+          <w:rtl/>
+          <w:lang w:bidi="ar-SA"/>
+        </w:rPr>
+        <w:t xml:space="preserve"> اعمال شده: یک </w:t>
+      </w:r>
+      <w:r>
+        <w:t>rift</w:t>
+      </w:r>
+      <w:r>
+        <w:rPr>
+          <w:rtl/>
+          <w:lang w:bidi="ar-SA"/>
+        </w:rPr>
+        <w:t xml:space="preserve"> فقط زمانی به‌عنوان ایستگاه بعدی مجاز در نظر گرفته می‌شود که تعداد فرگمنت جمع‌شده در همان ترتیب خاص، شرط آن </w:t>
+      </w:r>
+      <w:r>
+        <w:t>rift</w:t>
+      </w:r>
+      <w:r>
+        <w:rPr>
+          <w:rtl/>
+          <w:lang w:bidi="ar-SA"/>
+        </w:rPr>
+        <w:t xml:space="preserve"> را برآورده کند. این تنگ‌ترکردن باعث </w:t>
       </w:r>
       <w:r>
         <w:t>overestimate</w:t>
       </w:r>
       <w:r>
         <w:rPr>
-          <w:rFonts w:hint="cs"/>
-          <w:rtl/>
-        </w:rPr>
-        <w:t xml:space="preserve"> </w:t>
-      </w:r>
-      <w:r>
-        <w:rPr>
-          <w:rtl/>
-        </w:rPr>
-        <w:t>نمی‌شود</w:t>
-      </w:r>
-      <w:r>
-        <w:rPr>
-          <w:rFonts w:hint="cs"/>
-          <w:rtl/>
-        </w:rPr>
-        <w:t xml:space="preserve"> و </w:t>
-      </w:r>
-      <w:r>
-        <w:rPr>
-          <w:rtl/>
-        </w:rPr>
-        <w:t>فقط ترتیب‌های غیرمجاز را از فضای جست‌وجو حذف می‌کند.</w:t>
+          <w:rtl/>
+          <w:lang w:bidi="ar-SA"/>
+        </w:rPr>
+        <w:t xml:space="preserve"> نمی‌شود و فقط ترتیب‌های غیرمجاز را از فضای جست‌وجو حذف می‌کند.</w:t>
       </w:r>
     </w:p>
     <w:p>
+      <w:pPr>
+        <w:rPr>
+          <w:rtl/>
+          <w:lang w:bidi="ar-SA"/>
+        </w:rPr>
+      </w:pPr>
+      <w:r>
+        <w:rPr>
+          <w:rtl/>
+          <w:lang w:bidi="ar-SA"/>
+        </w:rPr>
+        <w:t>قابل‌قبول بودن</w:t>
+      </w:r>
       <w:r>
         <w:rPr>
           <w:rFonts w:hint="cs"/>
           <w:rtl/>
-        </w:rPr>
-        <w:t>از آنجایی که</w:t>
-      </w:r>
-      <w:r>
-        <w:t xml:space="preserve"> Dijkstra </w:t>
-      </w:r>
-      <w:r>
-        <w:rPr>
-          <w:rtl/>
-        </w:rPr>
-        <w:t xml:space="preserve">خروجی کوتاه‌ترین مسیر واقعی روی گرافی با وزن‌های نامنفی است، به‌طور خودکار نامساوی مثلثی را رعایت می‌کند </w:t>
-      </w:r>
-      <w:r>
-        <w:rPr>
-          <w:rFonts w:hint="cs"/>
-          <w:rtl/>
-        </w:rPr>
-        <w:t xml:space="preserve">و </w:t>
-      </w:r>
-      <w:r>
-        <w:rPr>
-          <w:rtl/>
-        </w:rPr>
-        <w:t>مسیر مستقیم از مسیر «برو به نقطه‌ی واسط، بعد به مقصد» گران‌تر نیست؛ همین ویژگی برای اثبات سازگاری</w:t>
-      </w:r>
-      <w:r>
-        <w:t xml:space="preserve">  </w:t>
-      </w:r>
-      <w:r>
-        <w:rPr>
-          <w:rtl/>
-        </w:rPr>
-        <w:t>لازم است. از طرف دیگر، چون</w:t>
-      </w:r>
-      <w:r>
-        <w:t xml:space="preserve"> DP </w:t>
-      </w:r>
-      <w:r>
-        <w:rPr>
-          <w:rtl/>
-        </w:rPr>
-        <w:t xml:space="preserve">دقیقاً کوتاه‌ترین تور مجاز میان اهداف باقی‌مانده را پیدا می‌کند </w:t>
-      </w:r>
-      <w:r>
-        <w:rPr>
-          <w:rFonts w:hint="cs"/>
-          <w:rtl/>
-        </w:rPr>
-        <w:t>و نتیجه اش براساس حدس نیست</w:t>
-      </w:r>
-      <w:r>
-        <w:rPr>
-          <w:rtl/>
-        </w:rPr>
-        <w:t xml:space="preserve">، مقدار خروجی هرگز از هزینه‌ی </w:t>
-      </w:r>
-      <w:r>
-        <w:rPr>
-          <w:rFonts w:hint="cs"/>
-          <w:rtl/>
-        </w:rPr>
-        <w:t xml:space="preserve">واقعی </w:t>
-      </w:r>
-      <w:r>
-        <w:rPr>
-          <w:rtl/>
-        </w:rPr>
-        <w:t>طی‌کردن بهینه‌ی همان اهداف بیشتر نمی‌شود</w:t>
-      </w:r>
-      <w:r>
-        <w:rPr>
-          <w:rFonts w:hint="cs"/>
-          <w:rtl/>
-        </w:rPr>
-        <w:t xml:space="preserve"> و میتوان گفت که هیوریستیک قابل‌قبول است. البته باتوحه به اینکه در ابتدا سازگاری را اثبات کردیم، لازم به اثبات جداگانه قابل‌قبول بودن نداریم و به طور خودکار ثابت میشود.</w:t>
-      </w:r>
-    </w:p>
-    <w:p>
-      <w:pPr>
-        <w:rPr>
-          <w:rFonts w:eastAsiaTheme="minorEastAsia"/>
-        </w:rPr>
-      </w:pPr>
-      <w:r>
-        <w:rPr>
-          <w:rFonts w:eastAsiaTheme="minorEastAsia" w:hint="cs"/>
-          <w:rtl/>
-        </w:rPr>
-        <w:t xml:space="preserve"> </w:t>
+          <w:lang w:bidi="ar-SA"/>
+        </w:rPr>
+        <w:t>:</w:t>
+      </w:r>
+      <w:r>
+        <w:rPr>
+          <w:rtl/>
+          <w:lang w:bidi="ar-SA"/>
+        </w:rPr>
+        <w:t xml:space="preserve"> می‌خواهیم نشان دهیم </w:t>
       </w:r>
       <m:oMath>
         <m:r>
@@ -1091,9 +884,6 @@
           </m:e>
         </m:d>
         <m:r>
-          <m:rPr>
-            <m:sty m:val="p"/>
-          </m:rPr>
           <w:rPr>
             <w:rFonts w:ascii="Cambria Math" w:hAnsi="Cambria Math"/>
           </w:rPr>
@@ -1117,9 +907,6 @@
           </m:e>
           <m:sup>
             <m:r>
-              <m:rPr>
-                <m:sty m:val="p"/>
-              </m:rPr>
               <w:rPr>
                 <w:rFonts w:ascii="Cambria Math" w:hAnsi="Cambria Math"/>
               </w:rPr>
@@ -1147,17 +934,571 @@
       </m:oMath>
       <w:r>
         <w:rPr>
-          <w:rFonts w:eastAsiaTheme="minorEastAsia" w:hint="cs"/>
-          <w:rtl/>
-        </w:rPr>
-        <w:t xml:space="preserve"> در هر حالت برقرار است و افت هزینه دو حالت مجاور از هزینه واقعی آن بیشتر نیست پس:</w:t>
+          <w:rtl/>
+          <w:lang w:bidi="ar-SA"/>
+        </w:rPr>
+        <w:t xml:space="preserve">. چون هر عدد جدول </w:t>
+      </w:r>
+      <w:r>
+        <w:t>Dijkstra</w:t>
+      </w:r>
+      <w:r>
+        <w:rPr>
+          <w:rtl/>
+          <w:lang w:bidi="ar-SA"/>
+        </w:rPr>
+        <w:t xml:space="preserve"> کوچک‌تر یا مساوی هزینه‌ی واقعی همان دو خانه است، و </w:t>
+      </w:r>
+      <w:r>
+        <w:t>DP</w:t>
+      </w:r>
+      <w:r>
+        <w:rPr>
+          <w:rtl/>
+          <w:lang w:bidi="ar-SA"/>
+        </w:rPr>
+        <w:t xml:space="preserve"> از میان تمام ترتیب‌های مجاز (نه یک حدس حریصانه) دقیقاً ارزان‌ترین ترتیب را با همین فاصله‌ها پیدا می‌کند، خروجی </w:t>
+      </w:r>
+      <w:r>
+        <w:t>DP</w:t>
+      </w:r>
+      <w:r>
+        <w:rPr>
+          <w:rtl/>
+          <w:lang w:bidi="ar-SA"/>
+        </w:rPr>
+        <w:t xml:space="preserve"> از هزینه‌ی واقعی طی‌کردن بهینه‌ی همان اهداف بیشتر نمی‌شود؛ پس </w:t>
+      </w:r>
+      <m:oMath>
+        <m:r>
+          <w:rPr>
+            <w:rFonts w:ascii="Cambria Math" w:hAnsi="Cambria Math"/>
+          </w:rPr>
+          <m:t>h</m:t>
+        </m:r>
+        <m:d>
+          <m:dPr>
+            <m:ctrlPr>
+              <w:rPr>
+                <w:rFonts w:ascii="Cambria Math" w:hAnsi="Cambria Math"/>
+              </w:rPr>
+            </m:ctrlPr>
+          </m:dPr>
+          <m:e>
+            <m:r>
+              <w:rPr>
+                <w:rFonts w:ascii="Cambria Math" w:hAnsi="Cambria Math"/>
+              </w:rPr>
+              <m:t>n</m:t>
+            </m:r>
+          </m:e>
+        </m:d>
+        <m:r>
+          <w:rPr>
+            <w:rFonts w:ascii="Cambria Math" w:hAnsi="Cambria Math"/>
+          </w:rPr>
+          <m:t>≤</m:t>
+        </m:r>
+        <m:sSup>
+          <m:sSupPr>
+            <m:ctrlPr>
+              <w:rPr>
+                <w:rFonts w:ascii="Cambria Math" w:hAnsi="Cambria Math"/>
+              </w:rPr>
+            </m:ctrlPr>
+          </m:sSupPr>
+          <m:e>
+            <m:r>
+              <w:rPr>
+                <w:rFonts w:ascii="Cambria Math" w:hAnsi="Cambria Math"/>
+              </w:rPr>
+              <m:t>h</m:t>
+            </m:r>
+          </m:e>
+          <m:sup>
+            <m:r>
+              <w:rPr>
+                <w:rFonts w:ascii="Cambria Math" w:hAnsi="Cambria Math"/>
+              </w:rPr>
+              <m:t>*</m:t>
+            </m:r>
+          </m:sup>
+        </m:sSup>
+        <m:d>
+          <m:dPr>
+            <m:ctrlPr>
+              <w:rPr>
+                <w:rFonts w:ascii="Cambria Math" w:hAnsi="Cambria Math"/>
+              </w:rPr>
+            </m:ctrlPr>
+          </m:dPr>
+          <m:e>
+            <m:r>
+              <w:rPr>
+                <w:rFonts w:ascii="Cambria Math" w:hAnsi="Cambria Math"/>
+              </w:rPr>
+              <m:t>n</m:t>
+            </m:r>
+          </m:e>
+        </m:d>
+      </m:oMath>
+      <w:r>
+        <w:rPr>
+          <w:rFonts w:eastAsiaTheme="minorEastAsia" w:hint="cs"/>
+          <w:rtl/>
+        </w:rPr>
+        <w:t xml:space="preserve"> </w:t>
+      </w:r>
+      <w:r>
+        <w:rPr>
+          <w:rtl/>
+          <w:lang w:bidi="ar-SA"/>
+        </w:rPr>
+        <w:t>و هیوریستیک قابل‌قبول است.</w:t>
       </w:r>
     </w:p>
     <w:p>
       <w:pPr>
         <w:rPr>
-          <w:rFonts w:eastAsiaTheme="minorEastAsia"/>
-          <w:rtl/>
+          <w:rtl/>
+          <w:lang w:bidi="ar-SA"/>
+        </w:rPr>
+      </w:pPr>
+      <w:r>
+        <w:rPr>
+          <w:rtl/>
+          <w:lang w:bidi="ar-SA"/>
+        </w:rPr>
+        <w:t>سازگار بودن</w:t>
+      </w:r>
+      <w:r>
+        <w:rPr>
+          <w:rFonts w:hint="cs"/>
+          <w:rtl/>
+          <w:lang w:bidi="ar-SA"/>
+        </w:rPr>
+        <w:t>:</w:t>
+      </w:r>
+      <w:r>
+        <w:rPr>
+          <w:rtl/>
+          <w:lang w:bidi="ar-SA"/>
+        </w:rPr>
+        <w:t xml:space="preserve"> می‌خواهیم نشان دهیم برای دو حالت مجاور </w:t>
+      </w:r>
+      <m:oMath>
+        <m:r>
+          <w:rPr>
+            <w:rFonts w:ascii="Cambria Math" w:hAnsi="Cambria Math"/>
+          </w:rPr>
+          <m:t>n</m:t>
+        </m:r>
+      </m:oMath>
+      <w:r>
+        <w:rPr>
+          <w:rFonts w:eastAsiaTheme="minorEastAsia" w:hint="cs"/>
+          <w:rtl/>
+        </w:rPr>
+        <w:t xml:space="preserve"> </w:t>
+      </w:r>
+      <w:r>
+        <w:rPr>
+          <w:rtl/>
+          <w:lang w:bidi="ar-SA"/>
+        </w:rPr>
+        <w:t xml:space="preserve">و </w:t>
+      </w:r>
+      <m:oMath>
+        <m:sSup>
+          <m:sSupPr>
+            <m:ctrlPr>
+              <w:rPr>
+                <w:rFonts w:ascii="Cambria Math" w:hAnsi="Cambria Math"/>
+              </w:rPr>
+            </m:ctrlPr>
+          </m:sSupPr>
+          <m:e>
+            <m:r>
+              <w:rPr>
+                <w:rFonts w:ascii="Cambria Math" w:hAnsi="Cambria Math"/>
+              </w:rPr>
+              <m:t>n</m:t>
+            </m:r>
+          </m:e>
+          <m:sup>
+            <m:r>
+              <w:rPr>
+                <w:rFonts w:ascii="Cambria Math" w:hAnsi="Cambria Math"/>
+              </w:rPr>
+              <m:t>'</m:t>
+            </m:r>
+          </m:sup>
+        </m:sSup>
+      </m:oMath>
+      <w:r>
+        <w:rPr>
+          <w:rtl/>
+          <w:lang w:bidi="ar-SA"/>
+        </w:rPr>
+        <w:t xml:space="preserve">: </w:t>
+      </w:r>
+      <m:oMath>
+        <m:r>
+          <w:rPr>
+            <w:rFonts w:ascii="Cambria Math" w:hAnsi="Cambria Math"/>
+          </w:rPr>
+          <m:t>h</m:t>
+        </m:r>
+        <m:d>
+          <m:dPr>
+            <m:ctrlPr>
+              <w:rPr>
+                <w:rFonts w:ascii="Cambria Math" w:hAnsi="Cambria Math"/>
+              </w:rPr>
+            </m:ctrlPr>
+          </m:dPr>
+          <m:e>
+            <m:r>
+              <w:rPr>
+                <w:rFonts w:ascii="Cambria Math" w:hAnsi="Cambria Math"/>
+              </w:rPr>
+              <m:t>n</m:t>
+            </m:r>
+          </m:e>
+        </m:d>
+        <m:r>
+          <w:rPr>
+            <w:rFonts w:ascii="Cambria Math" w:hAnsi="Cambria Math"/>
+          </w:rPr>
+          <m:t>-h</m:t>
+        </m:r>
+        <m:d>
+          <m:dPr>
+            <m:ctrlPr>
+              <w:rPr>
+                <w:rFonts w:ascii="Cambria Math" w:hAnsi="Cambria Math"/>
+              </w:rPr>
+            </m:ctrlPr>
+          </m:dPr>
+          <m:e>
+            <m:sSup>
+              <m:sSupPr>
+                <m:ctrlPr>
+                  <w:rPr>
+                    <w:rFonts w:ascii="Cambria Math" w:hAnsi="Cambria Math"/>
+                  </w:rPr>
+                </m:ctrlPr>
+              </m:sSupPr>
+              <m:e>
+                <m:r>
+                  <w:rPr>
+                    <w:rFonts w:ascii="Cambria Math" w:hAnsi="Cambria Math"/>
+                  </w:rPr>
+                  <m:t>n</m:t>
+                </m:r>
+              </m:e>
+              <m:sup>
+                <m:r>
+                  <w:rPr>
+                    <w:rFonts w:ascii="Cambria Math" w:hAnsi="Cambria Math"/>
+                  </w:rPr>
+                  <m:t>'</m:t>
+                </m:r>
+              </m:sup>
+            </m:sSup>
+          </m:e>
+        </m:d>
+        <m:r>
+          <w:rPr>
+            <w:rFonts w:ascii="Cambria Math" w:hAnsi="Cambria Math"/>
+          </w:rPr>
+          <m:t>≤c</m:t>
+        </m:r>
+        <m:d>
+          <m:dPr>
+            <m:sepChr m:val=","/>
+            <m:ctrlPr>
+              <w:rPr>
+                <w:rFonts w:ascii="Cambria Math" w:hAnsi="Cambria Math"/>
+              </w:rPr>
+            </m:ctrlPr>
+          </m:dPr>
+          <m:e>
+            <m:r>
+              <w:rPr>
+                <w:rFonts w:ascii="Cambria Math" w:hAnsi="Cambria Math"/>
+              </w:rPr>
+              <m:t>n</m:t>
+            </m:r>
+          </m:e>
+          <m:e>
+            <m:r>
+              <w:rPr>
+                <w:rFonts w:ascii="Cambria Math" w:hAnsi="Cambria Math"/>
+              </w:rPr>
+              <m:t>a</m:t>
+            </m:r>
+          </m:e>
+          <m:e>
+            <m:sSup>
+              <m:sSupPr>
+                <m:ctrlPr>
+                  <w:rPr>
+                    <w:rFonts w:ascii="Cambria Math" w:hAnsi="Cambria Math"/>
+                  </w:rPr>
+                </m:ctrlPr>
+              </m:sSupPr>
+              <m:e>
+                <m:r>
+                  <w:rPr>
+                    <w:rFonts w:ascii="Cambria Math" w:hAnsi="Cambria Math"/>
+                  </w:rPr>
+                  <m:t>n</m:t>
+                </m:r>
+              </m:e>
+              <m:sup>
+                <m:r>
+                  <w:rPr>
+                    <w:rFonts w:ascii="Cambria Math" w:hAnsi="Cambria Math"/>
+                  </w:rPr>
+                  <m:t>'</m:t>
+                </m:r>
+              </m:sup>
+            </m:sSup>
+          </m:e>
+        </m:d>
+      </m:oMath>
+      <w:r>
+        <w:rPr>
+          <w:rtl/>
+          <w:lang w:bidi="ar-SA"/>
+        </w:rPr>
+        <w:t>.</w:t>
+      </w:r>
+      <w:r>
+        <w:rPr>
+          <w:rtl/>
+          <w:lang w:bidi="ar-SA"/>
+        </w:rPr>
+        <w:br/>
+      </w:r>
+      <w:r>
+        <w:rPr>
+          <w:rtl/>
+          <w:lang w:bidi="ar-SA"/>
+        </w:rPr>
+        <w:t xml:space="preserve">چون </w:t>
+      </w:r>
+      <w:r>
+        <w:t>Dijkstra</w:t>
+      </w:r>
+      <w:r>
+        <w:rPr>
+          <w:rtl/>
+          <w:lang w:bidi="ar-SA"/>
+        </w:rPr>
+        <w:t xml:space="preserve"> خروجی کوتاه‌ترین مسیر واقعی روی گرافی با وزن‌های نامنفی است، به‌طور خودکار نامساوی مثلثی را رعایت می‌کند و مسیر مستقیم از مسیر «برو به نقطه‌ی واسط، بعد به مقصد» گران‌تر نیست. حال تور بهینه‌ی </w:t>
+      </w:r>
+      <m:oMath>
+        <m:r>
+          <w:rPr>
+            <w:rFonts w:ascii="Cambria Math" w:hAnsi="Cambria Math"/>
+          </w:rPr>
+          <m:t>n</m:t>
+        </m:r>
+      </m:oMath>
+      <w:r>
+        <w:rPr>
+          <w:rFonts w:eastAsiaTheme="minorEastAsia" w:hint="cs"/>
+          <w:rtl/>
+        </w:rPr>
+        <w:t xml:space="preserve"> </w:t>
+      </w:r>
+      <w:r>
+        <w:rPr>
+          <w:rtl/>
+          <w:lang w:bidi="ar-SA"/>
+        </w:rPr>
+        <w:t xml:space="preserve">را در نظر بگیرید: یک تور مجاز برای </w:t>
+      </w:r>
+      <m:oMath>
+        <m:r>
+          <w:rPr>
+            <w:rFonts w:ascii="Cambria Math" w:hAnsi="Cambria Math"/>
+          </w:rPr>
+          <m:t>n</m:t>
+        </m:r>
+      </m:oMath>
+      <w:r>
+        <w:rPr>
+          <w:rFonts w:eastAsiaTheme="minorEastAsia" w:hint="cs"/>
+          <w:rtl/>
+        </w:rPr>
+        <w:t xml:space="preserve"> </w:t>
+      </w:r>
+      <w:r>
+        <w:rPr>
+          <w:rtl/>
+          <w:lang w:bidi="ar-SA"/>
+        </w:rPr>
+        <w:t xml:space="preserve">این است که ابتدا یک قدم به </w:t>
+      </w:r>
+      <m:oMath>
+        <m:sSup>
+          <m:sSupPr>
+            <m:ctrlPr>
+              <w:rPr>
+                <w:rFonts w:ascii="Cambria Math" w:hAnsi="Cambria Math"/>
+              </w:rPr>
+            </m:ctrlPr>
+          </m:sSupPr>
+          <m:e>
+            <m:r>
+              <w:rPr>
+                <w:rFonts w:ascii="Cambria Math" w:hAnsi="Cambria Math"/>
+              </w:rPr>
+              <m:t>n</m:t>
+            </m:r>
+          </m:e>
+          <m:sup>
+            <m:r>
+              <w:rPr>
+                <w:rFonts w:ascii="Cambria Math" w:hAnsi="Cambria Math"/>
+              </w:rPr>
+              <m:t>'</m:t>
+            </m:r>
+          </m:sup>
+        </m:sSup>
+      </m:oMath>
+      <w:r>
+        <w:rPr>
+          <w:rFonts w:eastAsiaTheme="minorEastAsia" w:hint="cs"/>
+          <w:rtl/>
+        </w:rPr>
+        <w:t xml:space="preserve"> </w:t>
+      </w:r>
+      <w:r>
+        <w:rPr>
+          <w:rtl/>
+          <w:lang w:bidi="ar-SA"/>
+        </w:rPr>
+        <w:t xml:space="preserve">برویم (به هزینه‌ی </w:t>
+      </w:r>
+      <m:oMath>
+        <m:r>
+          <w:rPr>
+            <w:rFonts w:ascii="Cambria Math" w:hAnsi="Cambria Math"/>
+          </w:rPr>
+          <m:t>c</m:t>
+        </m:r>
+        <m:d>
+          <m:dPr>
+            <m:sepChr m:val=","/>
+            <m:ctrlPr>
+              <w:rPr>
+                <w:rFonts w:ascii="Cambria Math" w:hAnsi="Cambria Math"/>
+              </w:rPr>
+            </m:ctrlPr>
+          </m:dPr>
+          <m:e>
+            <m:r>
+              <w:rPr>
+                <w:rFonts w:ascii="Cambria Math" w:hAnsi="Cambria Math"/>
+              </w:rPr>
+              <m:t>n</m:t>
+            </m:r>
+          </m:e>
+          <m:e>
+            <m:r>
+              <w:rPr>
+                <w:rFonts w:ascii="Cambria Math" w:hAnsi="Cambria Math"/>
+              </w:rPr>
+              <m:t>a</m:t>
+            </m:r>
+          </m:e>
+          <m:e>
+            <m:sSup>
+              <m:sSupPr>
+                <m:ctrlPr>
+                  <w:rPr>
+                    <w:rFonts w:ascii="Cambria Math" w:hAnsi="Cambria Math"/>
+                  </w:rPr>
+                </m:ctrlPr>
+              </m:sSupPr>
+              <m:e>
+                <m:r>
+                  <w:rPr>
+                    <w:rFonts w:ascii="Cambria Math" w:hAnsi="Cambria Math"/>
+                  </w:rPr>
+                  <m:t>n</m:t>
+                </m:r>
+              </m:e>
+              <m:sup>
+                <m:r>
+                  <w:rPr>
+                    <w:rFonts w:ascii="Cambria Math" w:hAnsi="Cambria Math"/>
+                  </w:rPr>
+                  <m:t>'</m:t>
+                </m:r>
+              </m:sup>
+            </m:sSup>
+          </m:e>
+        </m:d>
+      </m:oMath>
+      <w:r>
+        <w:rPr>
+          <w:rtl/>
+          <w:lang w:bidi="ar-SA"/>
+        </w:rPr>
+        <w:t xml:space="preserve">) و از آن‌جا تور بهینه‌ی </w:t>
+      </w:r>
+      <m:oMath>
+        <m:sSup>
+          <m:sSupPr>
+            <m:ctrlPr>
+              <w:rPr>
+                <w:rFonts w:ascii="Cambria Math" w:hAnsi="Cambria Math"/>
+              </w:rPr>
+            </m:ctrlPr>
+          </m:sSupPr>
+          <m:e>
+            <m:r>
+              <w:rPr>
+                <w:rFonts w:ascii="Cambria Math" w:hAnsi="Cambria Math"/>
+              </w:rPr>
+              <m:t>n</m:t>
+            </m:r>
+          </m:e>
+          <m:sup>
+            <m:r>
+              <w:rPr>
+                <w:rFonts w:ascii="Cambria Math" w:hAnsi="Cambria Math"/>
+              </w:rPr>
+              <m:t>'</m:t>
+            </m:r>
+          </m:sup>
+        </m:sSup>
+      </m:oMath>
+      <w:r>
+        <w:rPr>
+          <w:rFonts w:eastAsiaTheme="minorEastAsia" w:hint="cs"/>
+          <w:rtl/>
+        </w:rPr>
+        <w:t xml:space="preserve"> </w:t>
+      </w:r>
+      <w:r>
+        <w:rPr>
+          <w:rtl/>
+          <w:lang w:bidi="ar-SA"/>
+        </w:rPr>
+        <w:t>را دنبال کنیم، پس:</w:t>
+      </w:r>
+    </w:p>
+    <w:p>
+      <w:pPr>
+        <w:rPr>
+          <w:rtl/>
+          <w:lang w:bidi="ar-SA"/>
         </w:rPr>
       </w:pPr>
       <m:oMathPara>
@@ -1186,14 +1527,111 @@
             </m:e>
           </m:d>
           <m:r>
-            <m:rPr>
-              <m:sty m:val="p"/>
-            </m:rPr>
             <w:rPr>
               <w:rFonts w:ascii="Cambria Math" w:hAnsi="Cambria Math"/>
             </w:rPr>
-            <m:t>-</m:t>
+            <m:t>≤c</m:t>
           </m:r>
+          <m:d>
+            <m:dPr>
+              <m:sepChr m:val=","/>
+              <m:ctrlPr>
+                <w:rPr>
+                  <w:rFonts w:ascii="Cambria Math" w:hAnsi="Cambria Math"/>
+                </w:rPr>
+              </m:ctrlPr>
+            </m:dPr>
+            <m:e>
+              <m:r>
+                <w:rPr>
+                  <w:rFonts w:ascii="Cambria Math" w:hAnsi="Cambria Math"/>
+                </w:rPr>
+                <m:t>n</m:t>
+              </m:r>
+            </m:e>
+            <m:e>
+              <m:r>
+                <w:rPr>
+                  <w:rFonts w:ascii="Cambria Math" w:hAnsi="Cambria Math"/>
+                </w:rPr>
+                <m:t>a</m:t>
+              </m:r>
+            </m:e>
+            <m:e>
+              <m:sSup>
+                <m:sSupPr>
+                  <m:ctrlPr>
+                    <w:rPr>
+                      <w:rFonts w:ascii="Cambria Math" w:hAnsi="Cambria Math"/>
+                    </w:rPr>
+                  </m:ctrlPr>
+                </m:sSupPr>
+                <m:e>
+                  <m:r>
+                    <w:rPr>
+                      <w:rFonts w:ascii="Cambria Math" w:hAnsi="Cambria Math"/>
+                    </w:rPr>
+                    <m:t>n</m:t>
+                  </m:r>
+                </m:e>
+                <m:sup>
+                  <m:r>
+                    <w:rPr>
+                      <w:rFonts w:ascii="Cambria Math" w:hAnsi="Cambria Math"/>
+                    </w:rPr>
+                    <m:t>'</m:t>
+                  </m:r>
+                </m:sup>
+              </m:sSup>
+            </m:e>
+          </m:d>
+          <m:r>
+            <w:rPr>
+              <w:rFonts w:ascii="Cambria Math" w:hAnsi="Cambria Math"/>
+            </w:rPr>
+            <m:t>+h</m:t>
+          </m:r>
+          <m:d>
+            <m:dPr>
+              <m:ctrlPr>
+                <w:rPr>
+                  <w:rFonts w:ascii="Cambria Math" w:hAnsi="Cambria Math"/>
+                </w:rPr>
+              </m:ctrlPr>
+            </m:dPr>
+            <m:e>
+              <m:sSup>
+                <m:sSupPr>
+                  <m:ctrlPr>
+                    <w:rPr>
+                      <w:rFonts w:ascii="Cambria Math" w:hAnsi="Cambria Math"/>
+                    </w:rPr>
+                  </m:ctrlPr>
+                </m:sSupPr>
+                <m:e>
+                  <m:r>
+                    <w:rPr>
+                      <w:rFonts w:ascii="Cambria Math" w:hAnsi="Cambria Math"/>
+                    </w:rPr>
+                    <m:t>n</m:t>
+                  </m:r>
+                </m:e>
+                <m:sup>
+                  <m:r>
+                    <w:rPr>
+                      <w:rFonts w:ascii="Cambria Math" w:hAnsi="Cambria Math"/>
+                    </w:rPr>
+                    <m:t>'</m:t>
+                  </m:r>
+                </m:sup>
+              </m:sSup>
+            </m:e>
+          </m:d>
+          <m:r>
+            <w:br/>
+          </m:r>
+        </m:oMath>
+        <m:oMath>
           <m:r>
             <w:rPr>
               <w:rFonts w:ascii="Cambria Math" w:hAnsi="Cambria Math"/>
@@ -1215,34 +1653,59 @@
                 </w:rPr>
                 <m:t>n</m:t>
               </m:r>
-              <m:r>
-                <m:rPr>
-                  <m:sty m:val="p"/>
-                </m:rPr>
-                <w:rPr>
-                  <w:rFonts w:ascii="Cambria Math" w:hAnsi="Cambria Math"/>
-                </w:rPr>
-                <m:t>'</m:t>
-              </m:r>
             </m:e>
           </m:d>
-          <m:r>
-            <m:rPr>
-              <m:sty m:val="p"/>
-            </m:rPr>
-            <w:rPr>
-              <w:rFonts w:ascii="Cambria Math" w:hAnsi="Cambria Math"/>
-            </w:rPr>
-            <m:t>≤</m:t>
-          </m:r>
           <m:r>
             <w:rPr>
               <w:rFonts w:ascii="Cambria Math" w:hAnsi="Cambria Math"/>
             </w:rPr>
-            <m:t>c</m:t>
+            <m:t>-h</m:t>
           </m:r>
           <m:d>
             <m:dPr>
+              <m:ctrlPr>
+                <w:rPr>
+                  <w:rFonts w:ascii="Cambria Math" w:hAnsi="Cambria Math"/>
+                </w:rPr>
+              </m:ctrlPr>
+            </m:dPr>
+            <m:e>
+              <m:sSup>
+                <m:sSupPr>
+                  <m:ctrlPr>
+                    <w:rPr>
+                      <w:rFonts w:ascii="Cambria Math" w:hAnsi="Cambria Math"/>
+                    </w:rPr>
+                  </m:ctrlPr>
+                </m:sSupPr>
+                <m:e>
+                  <m:r>
+                    <w:rPr>
+                      <w:rFonts w:ascii="Cambria Math" w:hAnsi="Cambria Math"/>
+                    </w:rPr>
+                    <m:t>n</m:t>
+                  </m:r>
+                </m:e>
+                <m:sup>
+                  <m:r>
+                    <w:rPr>
+                      <w:rFonts w:ascii="Cambria Math" w:hAnsi="Cambria Math"/>
+                    </w:rPr>
+                    <m:t>'</m:t>
+                  </m:r>
+                </m:sup>
+              </m:sSup>
+            </m:e>
+          </m:d>
+          <m:r>
+            <w:rPr>
+              <w:rFonts w:ascii="Cambria Math" w:hAnsi="Cambria Math"/>
+            </w:rPr>
+            <m:t>≤c</m:t>
+          </m:r>
+          <m:d>
+            <m:dPr>
+              <m:sepChr m:val=","/>
               <m:ctrlPr>
                 <w:rPr>
                   <w:rFonts w:ascii="Cambria Math" w:hAnsi="Cambria Math"/>
@@ -1256,160 +1719,212 @@
                 </w:rPr>
                 <m:t>n</m:t>
               </m:r>
-              <m:r>
-                <m:rPr>
-                  <m:sty m:val="p"/>
-                </m:rPr>
-                <w:rPr>
-                  <w:rFonts w:ascii="Cambria Math" w:hAnsi="Cambria Math"/>
-                </w:rPr>
-                <m:t>,</m:t>
-              </m:r>
+            </m:e>
+            <m:e>
               <m:r>
                 <w:rPr>
                   <w:rFonts w:ascii="Cambria Math" w:hAnsi="Cambria Math"/>
                 </w:rPr>
                 <m:t>a</m:t>
               </m:r>
-              <m:r>
-                <m:rPr>
-                  <m:sty m:val="p"/>
-                </m:rPr>
-                <w:rPr>
-                  <w:rFonts w:ascii="Cambria Math" w:hAnsi="Cambria Math"/>
-                </w:rPr>
-                <m:t>,</m:t>
-              </m:r>
-              <m:r>
-                <w:rPr>
-                  <w:rFonts w:ascii="Cambria Math" w:hAnsi="Cambria Math"/>
-                </w:rPr>
-                <m:t>n</m:t>
-              </m:r>
-              <m:r>
-                <m:rPr>
-                  <m:sty m:val="p"/>
-                </m:rPr>
-                <w:rPr>
-                  <w:rFonts w:ascii="Cambria Math" w:hAnsi="Cambria Math"/>
-                </w:rPr>
-                <m:t>'</m:t>
-              </m:r>
+            </m:e>
+            <m:e>
+              <m:sSup>
+                <m:sSupPr>
+                  <m:ctrlPr>
+                    <w:rPr>
+                      <w:rFonts w:ascii="Cambria Math" w:hAnsi="Cambria Math"/>
+                    </w:rPr>
+                  </m:ctrlPr>
+                </m:sSupPr>
+                <m:e>
+                  <m:r>
+                    <w:rPr>
+                      <w:rFonts w:ascii="Cambria Math" w:hAnsi="Cambria Math"/>
+                    </w:rPr>
+                    <m:t>n</m:t>
+                  </m:r>
+                </m:e>
+                <m:sup>
+                  <m:r>
+                    <w:rPr>
+                      <w:rFonts w:ascii="Cambria Math" w:hAnsi="Cambria Math"/>
+                    </w:rPr>
+                    <m:t>'</m:t>
+                  </m:r>
+                </m:sup>
+              </m:sSup>
             </m:e>
           </m:d>
+          <m:r>
+            <w:br/>
+          </m:r>
         </m:oMath>
       </m:oMathPara>
     </w:p>
     <w:p>
-      <w:pPr>
-        <w:rPr>
-          <w:rtl/>
-        </w:rPr>
-      </w:pPr>
-      <w:r>
-        <w:rPr>
-          <w:rFonts w:eastAsiaTheme="minorEastAsia" w:hint="cs"/>
-          <w:rtl/>
-        </w:rPr>
-        <w:t xml:space="preserve">در این حالت، در محاسبه </w:t>
-      </w:r>
-      <w:r>
-        <w:rPr>
-          <w:rFonts w:eastAsiaTheme="minorEastAsia"/>
-        </w:rPr>
-        <w:t>Dijkstra</w:t>
-      </w:r>
-      <w:r>
-        <w:rPr>
-          <w:rFonts w:eastAsiaTheme="minorEastAsia" w:hint="cs"/>
-          <w:rtl/>
-        </w:rPr>
-        <w:t xml:space="preserve">، اثر هزینه کاشی های </w:t>
-      </w:r>
-      <w:r>
-        <w:t>Distortion</w:t>
-      </w:r>
-      <w:r>
-        <w:rPr>
-          <w:rFonts w:hint="cs"/>
-          <w:rtl/>
-        </w:rPr>
-        <w:t xml:space="preserve"> </w:t>
-      </w:r>
-      <w:r>
-        <w:rPr>
-          <w:rtl/>
-        </w:rPr>
-        <w:t>لحاظ</w:t>
-      </w:r>
-      <w:r>
-        <w:rPr>
-          <w:rFonts w:hint="cs"/>
-          <w:rtl/>
-        </w:rPr>
-        <w:t xml:space="preserve"> میشود و تضمین میکند که این جریمه ها باعث </w:t>
-      </w:r>
-      <w:r>
-        <w:t>overestimate</w:t>
-      </w:r>
-      <w:r>
-        <w:rPr>
-          <w:rFonts w:hint="cs"/>
-          <w:rtl/>
-        </w:rPr>
-        <w:t xml:space="preserve"> نمیشود.</w:t>
+      <w:r>
+        <w:rPr>
+          <w:rtl/>
+          <w:lang w:bidi="ar-SA"/>
+        </w:rPr>
+        <w:t xml:space="preserve">از آن‌جا که هر هیوریستیک سازگار، قابل‌قبول هم هست، این اثبات به‌تنهایی برای هر دو ویژگی کافی بود؛ اثبات قابل‌قبولی بالا را جدا آوردیم چون استدلالش (بهینگی </w:t>
+      </w:r>
+      <w:r>
+        <w:t>DP</w:t>
+      </w:r>
+      <w:r>
+        <w:rPr>
+          <w:rtl/>
+          <w:lang w:bidi="ar-SA"/>
+        </w:rPr>
+        <w:t>) شهودی‌تر و مستقیم‌تر است.</w:t>
       </w:r>
     </w:p>
     <w:p>
       <w:pPr>
         <w:rPr>
           <w:rtl/>
-        </w:rPr>
-      </w:pPr>
-      <w:r>
-        <w:rPr>
-          <w:rFonts w:hint="cs"/>
-          <w:rtl/>
-        </w:rPr>
-        <w:t xml:space="preserve">هیوریستیک جدید روی نقشه اولیه داده شده و نقشه های ثانویه آزمایش شد و با اضافه کردن نقشه های جدید و اجرای برنامه </w:t>
-      </w:r>
-      <w:r>
-        <w:t>benchmark_report.py</w:t>
-      </w:r>
-      <w:r>
-        <w:rPr>
-          <w:rFonts w:hint="cs"/>
-          <w:rtl/>
-        </w:rPr>
-        <w:t xml:space="preserve"> ضمیمه شده میتوان عملکرد آن را نسبت به نسخه </w:t>
-      </w:r>
-      <w:r>
-        <w:t>Baseline</w:t>
-      </w:r>
-      <w:r>
-        <w:rPr>
-          <w:rFonts w:hint="cs"/>
-          <w:rtl/>
-        </w:rPr>
-        <w:t xml:space="preserve"> مقایسه کرد.</w:t>
+          <w:lang w:bidi="ar-SA"/>
+        </w:rPr>
+      </w:pPr>
+      <w:r>
+        <w:rPr>
+          <w:rtl/>
+          <w:lang w:bidi="ar-SA"/>
+        </w:rPr>
+        <w:t xml:space="preserve">در این حالت، در محاسبه‌ی </w:t>
+      </w:r>
+      <w:r>
+        <w:t>Dijkstra</w:t>
+      </w:r>
+      <w:r>
+        <w:rPr>
+          <w:rtl/>
+          <w:lang w:bidi="ar-SA"/>
+        </w:rPr>
+        <w:t xml:space="preserve">، اثر هزینه‌ی کاشی‌های </w:t>
+      </w:r>
+      <w:r>
+        <w:t>Distortion</w:t>
+      </w:r>
+      <w:r>
+        <w:rPr>
+          <w:rtl/>
+          <w:lang w:bidi="ar-SA"/>
+        </w:rPr>
+        <w:t xml:space="preserve"> لحاظ می‌شود و تضمین می‌کند این جریمه‌ها باعث </w:t>
+      </w:r>
+      <w:r>
+        <w:t>overestimate</w:t>
+      </w:r>
+      <w:r>
+        <w:rPr>
+          <w:rtl/>
+          <w:lang w:bidi="ar-SA"/>
+        </w:rPr>
+        <w:t xml:space="preserve"> نمی‌شوند.</w:t>
       </w:r>
     </w:p>
     <w:p>
       <w:pPr>
         <w:rPr>
           <w:rtl/>
-        </w:rPr>
-      </w:pPr>
-      <w:r>
-        <w:rPr>
-          <w:rFonts w:hint="cs"/>
-          <w:rtl/>
-        </w:rPr>
-        <w:t>مقایسه عملکرد در نقشه اصلی:</w:t>
-      </w:r>
+          <w:lang w:bidi="ar-SA"/>
+        </w:rPr>
+      </w:pPr>
     </w:p>
     <w:p>
       <w:pPr>
+        <w:rPr>
+          <w:rtl/>
+          <w:lang w:bidi="ar-SA"/>
+        </w:rPr>
+      </w:pPr>
+    </w:p>
+    <w:p>
+      <w:pPr>
+        <w:rPr>
+          <w:rtl/>
+          <w:lang w:bidi="ar-SA"/>
+        </w:rPr>
+      </w:pPr>
+    </w:p>
+    <w:p>
+      <w:pPr>
+        <w:rPr>
+          <w:rtl/>
+          <w:lang w:bidi="ar-SA"/>
+        </w:rPr>
+      </w:pPr>
+    </w:p>
+    <w:p>
+      <w:pPr>
+        <w:rPr>
+          <w:rtl/>
+          <w:lang w:bidi="ar-SA"/>
+        </w:rPr>
+      </w:pPr>
+    </w:p>
+    <w:p>
+      <w:pPr>
+        <w:rPr>
+          <w:rtl/>
+          <w:lang w:bidi="ar-SA"/>
+        </w:rPr>
+      </w:pPr>
+    </w:p>
+    <w:p>
+      <w:pPr>
+        <w:rPr>
+          <w:rtl/>
+        </w:rPr>
+      </w:pPr>
+      <w:r>
+        <w:rPr>
+          <w:rFonts w:hint="cs"/>
+          <w:rtl/>
+        </w:rPr>
+        <w:lastRenderedPageBreak/>
+        <w:t xml:space="preserve">هیوریستیک جدید روی نقشه اولیه داده شده و نقشه های ثانویه آزمایش شد و با اضافه کردن نقشه های جدید و اجرای برنامه </w:t>
+      </w:r>
+      <w:r>
+        <w:t>benchmark_report.py</w:t>
+      </w:r>
+      <w:r>
+        <w:rPr>
+          <w:rFonts w:hint="cs"/>
+          <w:rtl/>
+        </w:rPr>
+        <w:t xml:space="preserve"> ضمیمه شده میتوان عملکرد آن را نسبت به نسخه </w:t>
+      </w:r>
+      <w:r>
+        <w:t>Baseline</w:t>
+      </w:r>
+      <w:r>
+        <w:rPr>
+          <w:rFonts w:hint="cs"/>
+          <w:rtl/>
+        </w:rPr>
+        <w:t xml:space="preserve"> مقایسه کرد.</w:t>
+      </w:r>
+    </w:p>
+    <w:p>
+      <w:pPr>
+        <w:rPr>
+          <w:rtl/>
+        </w:rPr>
+      </w:pPr>
+      <w:r>
+        <w:rPr>
+          <w:rFonts w:hint="cs"/>
+          <w:rtl/>
+        </w:rPr>
+        <w:t>مقایسه عملکرد در نقشه اصلی:</w:t>
+      </w:r>
+    </w:p>
+    <w:p>
+      <w:pPr>
         <w:bidi w:val="0"/>
         <w:rPr>
           <w:rFonts w:eastAsiaTheme="minorEastAsia"/>
@@ -1419,9 +1934,10 @@
       <w:r>
         <w:rPr>
           <w:rFonts w:eastAsiaTheme="minorEastAsia"/>
+          <w:noProof/>
         </w:rPr>
         <w:drawing>
-          <wp:inline distT="0" distB="0" distL="0" distR="0" wp14:anchorId="4B37E576" wp14:editId="46BCEB16">
+          <wp:inline distT="0" distB="0" distL="0" distR="0" wp14:anchorId="4B37E576" wp14:editId="433051DC">
             <wp:extent cx="6492240" cy="2205355"/>
             <wp:effectExtent l="0" t="0" r="3810" b="4445"/>
             <wp:docPr id="392351364" name="Picture 1"/>
@@ -1460,7 +1976,7 @@
     <w:p>
       <w:pPr>
         <w:rPr>
-          <w:rFonts w:eastAsiaTheme="minorEastAsia" w:hint="cs"/>
+          <w:rFonts w:eastAsiaTheme="minorEastAsia"/>
           <w:rtl/>
         </w:rPr>
       </w:pPr>
@@ -1510,27 +2026,35 @@
         <w:rPr>
           <w:rFonts w:eastAsiaTheme="minorEastAsia"/>
         </w:rPr>
-        <w:lastRenderedPageBreak/>
         <w:t xml:space="preserve"> </w:t>
-      </w:r>
-      <w:r>
-        <w:rPr>
-          <w:rFonts w:eastAsiaTheme="minorEastAsia" w:hint="cs"/>
-          <w:rtl/>
-        </w:rPr>
-        <w:t>در نقشه دوم:</w:t>
       </w:r>
     </w:p>
     <w:p>
       <w:pPr>
         <w:rPr>
-          <w:rFonts w:eastAsiaTheme="minorEastAsia" w:hint="cs"/>
-          <w:rtl/>
-        </w:rPr>
-      </w:pPr>
-      <w:r>
-        <w:rPr>
-          <w:rFonts w:eastAsiaTheme="minorEastAsia"/>
+          <w:rFonts w:eastAsiaTheme="minorEastAsia"/>
+          <w:rtl/>
+        </w:rPr>
+      </w:pPr>
+      <w:r>
+        <w:rPr>
+          <w:rFonts w:eastAsiaTheme="minorEastAsia" w:hint="cs"/>
+          <w:rtl/>
+        </w:rPr>
+        <w:t>در نقشه دوم:</w:t>
+      </w:r>
+    </w:p>
+    <w:p>
+      <w:pPr>
+        <w:rPr>
+          <w:rFonts w:eastAsiaTheme="minorEastAsia"/>
+          <w:rtl/>
+        </w:rPr>
+      </w:pPr>
+      <w:r>
+        <w:rPr>
+          <w:rFonts w:eastAsiaTheme="minorEastAsia"/>
+          <w:noProof/>
           <w:rtl/>
         </w:rPr>
         <w:drawing>
@@ -1582,25 +2106,43 @@
       <w:pPr>
         <w:rPr>
           <w:rFonts w:eastAsiaTheme="minorEastAsia"/>
-        </w:rPr>
-      </w:pPr>
-      <w:r>
-        <w:rPr>
-          <w:rFonts w:eastAsiaTheme="minorEastAsia" w:hint="cs"/>
-          <w:rtl/>
-        </w:rPr>
-        <w:t>و نقشه سوم:</w:t>
-      </w:r>
+          <w:rtl/>
+        </w:rPr>
+      </w:pPr>
     </w:p>
     <w:p>
       <w:pPr>
         <w:rPr>
           <w:rFonts w:eastAsiaTheme="minorEastAsia"/>
-        </w:rPr>
-      </w:pPr>
-      <w:r>
-        <w:rPr>
-          <w:rFonts w:eastAsiaTheme="minorEastAsia"/>
+          <w:rtl/>
+        </w:rPr>
+      </w:pPr>
+    </w:p>
+    <w:p>
+      <w:pPr>
+        <w:rPr>
+          <w:rFonts w:eastAsiaTheme="minorEastAsia"/>
+        </w:rPr>
+      </w:pPr>
+      <w:r>
+        <w:rPr>
+          <w:rFonts w:eastAsiaTheme="minorEastAsia" w:hint="cs"/>
+          <w:rtl/>
+        </w:rPr>
+        <w:lastRenderedPageBreak/>
+        <w:t>و نقشه سوم:</w:t>
+      </w:r>
+    </w:p>
+    <w:p>
+      <w:pPr>
+        <w:rPr>
+          <w:rFonts w:eastAsiaTheme="minorEastAsia"/>
+        </w:rPr>
+      </w:pPr>
+      <w:r>
+        <w:rPr>
+          <w:rFonts w:eastAsiaTheme="minorEastAsia"/>
+          <w:noProof/>
           <w:rtl/>
         </w:rPr>
         <w:drawing>
@@ -1780,30 +2322,6 @@
     <w:p>
       <w:pPr>
         <w:rPr>
-          <w:rFonts w:eastAsiaTheme="minorEastAsia"/>
-          <w:rtl/>
-        </w:rPr>
-      </w:pPr>
-    </w:p>
-    <w:p>
-      <w:pPr>
-        <w:rPr>
-          <w:rFonts w:eastAsiaTheme="minorEastAsia"/>
-          <w:rtl/>
-        </w:rPr>
-      </w:pPr>
-    </w:p>
-    <w:p>
-      <w:pPr>
-        <w:rPr>
-          <w:rFonts w:eastAsiaTheme="minorEastAsia" w:hint="cs"/>
-          <w:rtl/>
-        </w:rPr>
-      </w:pPr>
-    </w:p>
-    <w:p>
-      <w:pPr>
-        <w:rPr>
           <w:b/>
           <w:bCs/>
           <w:sz w:val="44"/>
@@ -1819,7 +2337,6 @@
           <w:szCs w:val="44"/>
           <w:rtl/>
         </w:rPr>
-        <w:lastRenderedPageBreak/>
         <w:t xml:space="preserve">بخش دوم - </w:t>
       </w:r>
       <w:proofErr w:type="spellStart"/>
@@ -2060,6 +2577,7 @@
           <w:rFonts w:eastAsiaTheme="minorEastAsia"/>
           <w:rtl/>
         </w:rPr>
+        <w:lastRenderedPageBreak/>
         <w:t>در هر مرحله، موقعیت بازی بر اساس برتری جان</w:t>
       </w:r>
       <w:r>
@@ -2358,7 +2876,6 @@
           <w:rFonts w:eastAsiaTheme="minorEastAsia" w:hint="cs"/>
           <w:rtl/>
         </w:rPr>
-        <w:lastRenderedPageBreak/>
         <w:t xml:space="preserve">اگر دشمن خط دید </w:t>
       </w:r>
       <w:r>
@@ -2514,6 +3031,24 @@
     </w:p>
     <w:p>
       <w:pPr>
+        <w:ind w:left="720"/>
+        <w:rPr>
+          <w:rFonts w:eastAsiaTheme="minorEastAsia"/>
+          <w:rtl/>
+        </w:rPr>
+      </w:pPr>
+    </w:p>
+    <w:p>
+      <w:pPr>
+        <w:ind w:left="720"/>
+        <w:rPr>
+          <w:rFonts w:eastAsiaTheme="minorEastAsia"/>
+          <w:rtl/>
+        </w:rPr>
+      </w:pPr>
+    </w:p>
+    <w:p>
+      <w:pPr>
         <w:rPr>
           <w:rFonts w:eastAsiaTheme="minorEastAsia"/>
           <w:b/>
@@ -2532,6 +3067,7 @@
           <w:szCs w:val="36"/>
           <w:rtl/>
         </w:rPr>
+        <w:lastRenderedPageBreak/>
         <w:t>مسافت فیزیکی</w:t>
       </w:r>
     </w:p>
@@ -2816,15 +3352,13 @@
         </w:numPr>
         <w:rPr>
           <w:rFonts w:eastAsiaTheme="minorEastAsia"/>
-          <w:rtl/>
-        </w:rPr>
-      </w:pPr>
-      <w:r>
-        <w:rPr>
-          <w:rFonts w:eastAsiaTheme="minorEastAsia" w:hint="cs"/>
-          <w:rtl/>
-        </w:rPr>
-        <w:lastRenderedPageBreak/>
+        </w:rPr>
+      </w:pPr>
+      <w:r>
+        <w:rPr>
+          <w:rFonts w:eastAsiaTheme="minorEastAsia" w:hint="cs"/>
+          <w:rtl/>
+        </w:rPr>
         <w:t xml:space="preserve">با مرتب‌سازی در نسخه </w:t>
       </w:r>
       <w:proofErr w:type="spellStart"/>
@@ -2979,11 +3513,20 @@
           <w:rtl/>
         </w:rPr>
       </w:pPr>
-      <w:r>
-        <w:rPr>
-          <w:rFonts w:eastAsiaTheme="minorEastAsia" w:hint="cs"/>
-          <w:rtl/>
-        </w:rPr>
+    </w:p>
+    <w:p>
+      <w:pPr>
+        <w:rPr>
+          <w:rFonts w:eastAsiaTheme="minorEastAsia"/>
+          <w:rtl/>
+        </w:rPr>
+      </w:pPr>
+      <w:r>
+        <w:rPr>
+          <w:rFonts w:eastAsiaTheme="minorEastAsia" w:hint="cs"/>
+          <w:rtl/>
+        </w:rPr>
+        <w:lastRenderedPageBreak/>
         <w:t>در پایان گزارش به بررسی سوالات پرسیده شده در پرونده تالیف پروژه میپردازیم:</w:t>
       </w:r>
     </w:p>
@@ -3671,15 +4214,7 @@
           <w:rFonts w:eastAsiaTheme="minorEastAsia" w:hint="cs"/>
           <w:rtl/>
         </w:rPr>
-        <w:t xml:space="preserve"> به هزینه حساس است و از بین مسیر با تعداد گام های کمتر </w:t>
-      </w:r>
-      <w:r>
-        <w:rPr>
-          <w:rFonts w:eastAsiaTheme="minorEastAsia" w:hint="cs"/>
-          <w:rtl/>
-        </w:rPr>
-        <w:lastRenderedPageBreak/>
-        <w:t xml:space="preserve">و مسیر با هزینه کمتر قطعا مسیر با هزینه کمتر را انتحاب میکند فارغ از تعداد گام ها. این اتفاق ممکن است مسیر پیشنهادی الگوریتم را عوض کند و حتی فضای جستجو را نیز بزرگتر کند </w:t>
+        <w:t xml:space="preserve"> به هزینه حساس است و از بین مسیر با تعداد گام های کمتر و مسیر با هزینه کمتر قطعا مسیر با هزینه کمتر را انتحاب میکند فارغ از تعداد گام ها. این اتفاق ممکن است مسیر پیشنهادی الگوریتم را عوض کند و حتی فضای جستجو را نیز بزرگتر کند </w:t>
       </w:r>
       <w:r>
         <w:rPr>
@@ -3870,7 +4405,15 @@
           <w:rFonts w:eastAsiaTheme="minorEastAsia" w:hint="cs"/>
           <w:rtl/>
         </w:rPr>
-        <w:t xml:space="preserve"> با این حال نتیجه ای که از تغییر تابع هیوریستیک حاصل شد این بود که اگر تابع ما بتواند به هزینه واقعی نزدیک تر باشد، ایده آل است و در این صورت میتوان با کمترین هزینه، زمان و بررسی به راه حل بهینه رسید. در هر 3 نقشه هزینه الگوریتم حریصانه کمتر و به واقعیت نزدیک تر شده است.</w:t>
+        <w:t xml:space="preserve"> با این </w:t>
+      </w:r>
+      <w:r>
+        <w:rPr>
+          <w:rFonts w:eastAsiaTheme="minorEastAsia" w:hint="cs"/>
+          <w:rtl/>
+        </w:rPr>
+        <w:lastRenderedPageBreak/>
+        <w:t>حال نتیجه ای که از تغییر تابع هیوریستیک حاصل شد این بود که اگر تابع ما بتواند به هزینه واقعی نزدیک تر باشد، ایده آل است و در این صورت میتوان با کمترین هزینه، زمان و بررسی به راه حل بهینه رسید. در هر 3 نقشه هزینه الگوریتم حریصانه کمتر و به واقعیت نزدیک تر شده است.</w:t>
       </w:r>
     </w:p>
     <w:p>
@@ -4794,1044 +5337,1037 @@
           <w:rFonts w:eastAsiaTheme="minorEastAsia" w:hint="cs"/>
           <w:rtl/>
         </w:rPr>
+        <w:t>همانطور که توضیح داده شد، تابع ارزیابی ما یک مجموعه وزن دار از این عوامل است:</w:t>
+      </w:r>
+      <w:r>
+        <w:rPr>
+          <w:rFonts w:eastAsiaTheme="minorEastAsia"/>
+          <w:rtl/>
+        </w:rPr>
+        <w:br/>
+      </w:r>
+      <w:r>
+        <w:rPr>
+          <w:rFonts w:eastAsiaTheme="minorEastAsia" w:hint="cs"/>
+          <w:rtl/>
+        </w:rPr>
+        <w:t xml:space="preserve">- </w:t>
+      </w:r>
+      <w:r>
+        <w:rPr>
+          <w:rFonts w:eastAsiaTheme="minorEastAsia"/>
+          <w:rtl/>
+        </w:rPr>
+        <w:t xml:space="preserve">اختلاف </w:t>
+      </w:r>
+      <w:r>
+        <w:rPr>
+          <w:rFonts w:eastAsiaTheme="minorEastAsia"/>
+        </w:rPr>
+        <w:t>HP</w:t>
+      </w:r>
+      <w:r>
+        <w:rPr>
+          <w:rFonts w:eastAsiaTheme="minorEastAsia"/>
+          <w:rtl/>
+        </w:rPr>
+        <w:t xml:space="preserve"> عامل‌ها با ضر</w:t>
+      </w:r>
+      <w:r>
+        <w:rPr>
+          <w:rFonts w:eastAsiaTheme="minorEastAsia" w:hint="cs"/>
+          <w:rtl/>
+        </w:rPr>
+        <w:t>ی</w:t>
+      </w:r>
+      <w:r>
+        <w:rPr>
+          <w:rFonts w:eastAsiaTheme="minorEastAsia" w:hint="eastAsia"/>
+          <w:rtl/>
+        </w:rPr>
+        <w:t>ب</w:t>
+      </w:r>
+      <w:r>
+        <w:rPr>
+          <w:rFonts w:eastAsiaTheme="minorEastAsia"/>
+          <w:rtl/>
+        </w:rPr>
+        <w:t xml:space="preserve"> 55 (مهم‌تر</w:t>
+      </w:r>
+      <w:r>
+        <w:rPr>
+          <w:rFonts w:eastAsiaTheme="minorEastAsia" w:hint="cs"/>
+          <w:rtl/>
+        </w:rPr>
+        <w:t>ی</w:t>
+      </w:r>
+      <w:r>
+        <w:rPr>
+          <w:rFonts w:eastAsiaTheme="minorEastAsia" w:hint="eastAsia"/>
+          <w:rtl/>
+        </w:rPr>
+        <w:t>ن</w:t>
+      </w:r>
+      <w:r>
+        <w:rPr>
+          <w:rFonts w:eastAsiaTheme="minorEastAsia"/>
+          <w:rtl/>
+        </w:rPr>
+        <w:t xml:space="preserve"> فاکتور)، که ا</w:t>
+      </w:r>
+      <w:r>
+        <w:rPr>
+          <w:rFonts w:eastAsiaTheme="minorEastAsia" w:hint="cs"/>
+          <w:rtl/>
+        </w:rPr>
+        <w:t>ی</w:t>
+      </w:r>
+      <w:r>
+        <w:rPr>
+          <w:rFonts w:eastAsiaTheme="minorEastAsia" w:hint="eastAsia"/>
+          <w:rtl/>
+        </w:rPr>
+        <w:t>ن</w:t>
+      </w:r>
+      <w:r>
+        <w:rPr>
+          <w:rFonts w:eastAsiaTheme="minorEastAsia"/>
+          <w:rtl/>
+        </w:rPr>
+        <w:t xml:space="preserve"> وزن ثابت ن</w:t>
+      </w:r>
+      <w:r>
+        <w:rPr>
+          <w:rFonts w:eastAsiaTheme="minorEastAsia" w:hint="cs"/>
+          <w:rtl/>
+        </w:rPr>
+        <w:t>ی</w:t>
+      </w:r>
+      <w:r>
+        <w:rPr>
+          <w:rFonts w:eastAsiaTheme="minorEastAsia" w:hint="eastAsia"/>
+          <w:rtl/>
+        </w:rPr>
+        <w:t>ست</w:t>
+      </w:r>
+      <w:r>
+        <w:rPr>
+          <w:rFonts w:eastAsiaTheme="minorEastAsia"/>
+          <w:rtl/>
+        </w:rPr>
+        <w:t xml:space="preserve"> و هر زمان جان </w:t>
+      </w:r>
+      <w:r>
+        <w:rPr>
+          <w:rFonts w:eastAsiaTheme="minorEastAsia" w:hint="cs"/>
+          <w:rtl/>
+        </w:rPr>
+        <w:t>ی</w:t>
+      </w:r>
+      <w:r>
+        <w:rPr>
+          <w:rFonts w:eastAsiaTheme="minorEastAsia" w:hint="eastAsia"/>
+          <w:rtl/>
+        </w:rPr>
+        <w:t>ک</w:t>
+      </w:r>
+      <w:r>
+        <w:rPr>
+          <w:rFonts w:eastAsiaTheme="minorEastAsia" w:hint="cs"/>
+          <w:rtl/>
+        </w:rPr>
+        <w:t>ی</w:t>
+      </w:r>
+      <w:r>
+        <w:rPr>
+          <w:rFonts w:eastAsiaTheme="minorEastAsia"/>
+          <w:rtl/>
+        </w:rPr>
+        <w:t xml:space="preserve"> از دو </w:t>
+      </w:r>
+      <w:r>
+        <w:rPr>
+          <w:rFonts w:eastAsiaTheme="minorEastAsia" w:hint="cs"/>
+          <w:rtl/>
+        </w:rPr>
+        <w:t xml:space="preserve">عامل </w:t>
+      </w:r>
+      <w:r>
+        <w:rPr>
+          <w:rFonts w:eastAsiaTheme="minorEastAsia"/>
+          <w:rtl/>
+        </w:rPr>
+        <w:t>به کمتر از 6 برسد، اثر آن ب</w:t>
+      </w:r>
+      <w:r>
+        <w:rPr>
+          <w:rFonts w:eastAsiaTheme="minorEastAsia" w:hint="cs"/>
+          <w:rtl/>
+        </w:rPr>
+        <w:t>ی</w:t>
+      </w:r>
+      <w:r>
+        <w:rPr>
+          <w:rFonts w:eastAsiaTheme="minorEastAsia" w:hint="eastAsia"/>
+          <w:rtl/>
+        </w:rPr>
+        <w:t>شتر</w:t>
+      </w:r>
+      <w:r>
+        <w:rPr>
+          <w:rFonts w:eastAsiaTheme="minorEastAsia"/>
+          <w:rtl/>
+        </w:rPr>
+        <w:t xml:space="preserve"> م</w:t>
+      </w:r>
+      <w:r>
+        <w:rPr>
+          <w:rFonts w:eastAsiaTheme="minorEastAsia" w:hint="cs"/>
+          <w:rtl/>
+        </w:rPr>
+        <w:t>ی‌</w:t>
+      </w:r>
+      <w:r>
+        <w:rPr>
+          <w:rFonts w:eastAsiaTheme="minorEastAsia" w:hint="eastAsia"/>
+          <w:rtl/>
+        </w:rPr>
+        <w:t>شود</w:t>
+      </w:r>
+      <w:r>
+        <w:rPr>
+          <w:rFonts w:eastAsiaTheme="minorEastAsia"/>
+          <w:rtl/>
+        </w:rPr>
+        <w:t xml:space="preserve"> تا الگور</w:t>
+      </w:r>
+      <w:r>
+        <w:rPr>
+          <w:rFonts w:eastAsiaTheme="minorEastAsia" w:hint="cs"/>
+          <w:rtl/>
+        </w:rPr>
+        <w:t>ی</w:t>
+      </w:r>
+      <w:r>
+        <w:rPr>
+          <w:rFonts w:eastAsiaTheme="minorEastAsia" w:hint="eastAsia"/>
+          <w:rtl/>
+        </w:rPr>
+        <w:t>تم</w:t>
+      </w:r>
+      <w:r>
+        <w:rPr>
+          <w:rFonts w:eastAsiaTheme="minorEastAsia"/>
+          <w:rtl/>
+        </w:rPr>
+        <w:t xml:space="preserve"> ب</w:t>
+      </w:r>
+      <w:r>
+        <w:rPr>
+          <w:rFonts w:eastAsiaTheme="minorEastAsia" w:hint="cs"/>
+          <w:rtl/>
+        </w:rPr>
+        <w:t>ی</w:t>
+      </w:r>
+      <w:r>
+        <w:rPr>
+          <w:rFonts w:eastAsiaTheme="minorEastAsia" w:hint="eastAsia"/>
+          <w:rtl/>
+        </w:rPr>
+        <w:t>ن</w:t>
+      </w:r>
+      <w:r>
+        <w:rPr>
+          <w:rFonts w:eastAsiaTheme="minorEastAsia"/>
+          <w:rtl/>
+        </w:rPr>
+        <w:t xml:space="preserve"> حالت عاد</w:t>
+      </w:r>
+      <w:r>
+        <w:rPr>
+          <w:rFonts w:eastAsiaTheme="minorEastAsia" w:hint="cs"/>
+          <w:rtl/>
+        </w:rPr>
+        <w:t>ی</w:t>
+      </w:r>
+      <w:r>
+        <w:rPr>
+          <w:rFonts w:eastAsiaTheme="minorEastAsia"/>
+          <w:rtl/>
+        </w:rPr>
+        <w:t xml:space="preserve"> و حالت بحران</w:t>
+      </w:r>
+      <w:r>
+        <w:rPr>
+          <w:rFonts w:eastAsiaTheme="minorEastAsia" w:hint="cs"/>
+          <w:rtl/>
+        </w:rPr>
+        <w:t xml:space="preserve">ی </w:t>
+      </w:r>
+      <w:r>
+        <w:rPr>
+          <w:rFonts w:eastAsiaTheme="minorEastAsia"/>
+          <w:rtl/>
+        </w:rPr>
+        <w:t>تما</w:t>
+      </w:r>
+      <w:r>
+        <w:rPr>
+          <w:rFonts w:eastAsiaTheme="minorEastAsia" w:hint="cs"/>
+          <w:rtl/>
+        </w:rPr>
+        <w:t>ی</w:t>
+      </w:r>
+      <w:r>
+        <w:rPr>
+          <w:rFonts w:eastAsiaTheme="minorEastAsia" w:hint="eastAsia"/>
+          <w:rtl/>
+        </w:rPr>
+        <w:t>ز</w:t>
+      </w:r>
+      <w:r>
+        <w:rPr>
+          <w:rFonts w:eastAsiaTheme="minorEastAsia"/>
+          <w:rtl/>
+        </w:rPr>
+        <w:t xml:space="preserve"> قائل شود.</w:t>
+      </w:r>
+      <w:r>
+        <w:rPr>
+          <w:rFonts w:eastAsiaTheme="minorEastAsia"/>
+          <w:rtl/>
+        </w:rPr>
+        <w:br/>
+      </w:r>
+      <w:r>
+        <w:rPr>
+          <w:rFonts w:eastAsiaTheme="minorEastAsia" w:hint="cs"/>
+          <w:rtl/>
+        </w:rPr>
+        <w:t xml:space="preserve">- </w:t>
+      </w:r>
+      <w:r>
+        <w:rPr>
+          <w:rFonts w:eastAsiaTheme="minorEastAsia" w:hint="eastAsia"/>
+          <w:rtl/>
+        </w:rPr>
+        <w:t>تفاوت</w:t>
+      </w:r>
+      <w:r>
+        <w:rPr>
+          <w:rFonts w:eastAsiaTheme="minorEastAsia"/>
+          <w:rtl/>
+        </w:rPr>
+        <w:t xml:space="preserve"> مقدار انرژ</w:t>
+      </w:r>
+      <w:r>
+        <w:rPr>
+          <w:rFonts w:eastAsiaTheme="minorEastAsia" w:hint="cs"/>
+          <w:rtl/>
+        </w:rPr>
+        <w:t>ی</w:t>
+      </w:r>
+      <w:r>
+        <w:rPr>
+          <w:rFonts w:eastAsiaTheme="minorEastAsia"/>
+          <w:rtl/>
+        </w:rPr>
+        <w:t xml:space="preserve"> عامل‌ها با ضر</w:t>
+      </w:r>
+      <w:r>
+        <w:rPr>
+          <w:rFonts w:eastAsiaTheme="minorEastAsia" w:hint="cs"/>
+          <w:rtl/>
+        </w:rPr>
+        <w:t>ی</w:t>
+      </w:r>
+      <w:r>
+        <w:rPr>
+          <w:rFonts w:eastAsiaTheme="minorEastAsia" w:hint="eastAsia"/>
+          <w:rtl/>
+        </w:rPr>
+        <w:t>ب</w:t>
+      </w:r>
+      <w:r>
+        <w:rPr>
+          <w:rFonts w:eastAsiaTheme="minorEastAsia"/>
+          <w:rtl/>
+        </w:rPr>
+        <w:t xml:space="preserve"> 12، که عامل را به جا</w:t>
+      </w:r>
+      <w:r>
+        <w:rPr>
+          <w:rFonts w:eastAsiaTheme="minorEastAsia" w:hint="cs"/>
+          <w:rtl/>
+        </w:rPr>
+        <w:t>ی</w:t>
+      </w:r>
+      <w:r>
+        <w:rPr>
+          <w:rFonts w:eastAsiaTheme="minorEastAsia"/>
+          <w:rtl/>
+        </w:rPr>
+        <w:t xml:space="preserve"> حرکت ب</w:t>
+      </w:r>
+      <w:r>
+        <w:rPr>
+          <w:rFonts w:eastAsiaTheme="minorEastAsia" w:hint="cs"/>
+          <w:rtl/>
+        </w:rPr>
+        <w:t>ی‌</w:t>
+      </w:r>
+      <w:r>
+        <w:rPr>
+          <w:rFonts w:eastAsiaTheme="minorEastAsia" w:hint="eastAsia"/>
+          <w:rtl/>
+        </w:rPr>
+        <w:t>هدف،</w:t>
+      </w:r>
+      <w:r>
+        <w:rPr>
+          <w:rFonts w:eastAsiaTheme="minorEastAsia"/>
+          <w:rtl/>
+        </w:rPr>
+        <w:t xml:space="preserve"> به ذخ</w:t>
+      </w:r>
+      <w:r>
+        <w:rPr>
+          <w:rFonts w:eastAsiaTheme="minorEastAsia" w:hint="cs"/>
+          <w:rtl/>
+        </w:rPr>
+        <w:t>ی</w:t>
+      </w:r>
+      <w:r>
+        <w:rPr>
+          <w:rFonts w:eastAsiaTheme="minorEastAsia" w:hint="eastAsia"/>
+          <w:rtl/>
+        </w:rPr>
+        <w:t>ره</w:t>
+      </w:r>
+      <w:r>
+        <w:rPr>
+          <w:rFonts w:eastAsiaTheme="minorEastAsia"/>
+          <w:rtl/>
+        </w:rPr>
+        <w:t xml:space="preserve"> انرژ</w:t>
+      </w:r>
+      <w:r>
+        <w:rPr>
+          <w:rFonts w:eastAsiaTheme="minorEastAsia" w:hint="cs"/>
+          <w:rtl/>
+        </w:rPr>
+        <w:t>ی</w:t>
+      </w:r>
+      <w:r>
+        <w:rPr>
+          <w:rFonts w:eastAsiaTheme="minorEastAsia"/>
+          <w:rtl/>
+        </w:rPr>
+        <w:t xml:space="preserve"> (اکشن </w:t>
+      </w:r>
+      <w:r>
+        <w:rPr>
+          <w:rFonts w:eastAsiaTheme="minorEastAsia"/>
+        </w:rPr>
+        <w:t>Wait</w:t>
+      </w:r>
+      <w:r>
+        <w:rPr>
+          <w:rFonts w:eastAsiaTheme="minorEastAsia"/>
+          <w:rtl/>
+        </w:rPr>
+        <w:t>) در زمان امن ترغ</w:t>
+      </w:r>
+      <w:r>
+        <w:rPr>
+          <w:rFonts w:eastAsiaTheme="minorEastAsia" w:hint="cs"/>
+          <w:rtl/>
+        </w:rPr>
+        <w:t>ی</w:t>
+      </w:r>
+      <w:r>
+        <w:rPr>
+          <w:rFonts w:eastAsiaTheme="minorEastAsia" w:hint="eastAsia"/>
+          <w:rtl/>
+        </w:rPr>
+        <w:t>ب</w:t>
+      </w:r>
+      <w:r>
+        <w:rPr>
+          <w:rFonts w:eastAsiaTheme="minorEastAsia"/>
+          <w:rtl/>
+        </w:rPr>
+        <w:t xml:space="preserve"> م</w:t>
+      </w:r>
+      <w:r>
+        <w:rPr>
+          <w:rFonts w:eastAsiaTheme="minorEastAsia" w:hint="cs"/>
+          <w:rtl/>
+        </w:rPr>
+        <w:t>ی‌</w:t>
+      </w:r>
+      <w:r>
+        <w:rPr>
+          <w:rFonts w:eastAsiaTheme="minorEastAsia" w:hint="eastAsia"/>
+          <w:rtl/>
+        </w:rPr>
+        <w:t>کند</w:t>
+      </w:r>
+      <w:r>
+        <w:rPr>
+          <w:rFonts w:eastAsiaTheme="minorEastAsia"/>
+          <w:rtl/>
+        </w:rPr>
+        <w:t xml:space="preserve"> تا بتواند از </w:t>
+      </w:r>
+      <w:r>
+        <w:rPr>
+          <w:rFonts w:eastAsiaTheme="minorEastAsia"/>
+        </w:rPr>
+        <w:t>Beam</w:t>
+      </w:r>
+      <w:r>
+        <w:rPr>
+          <w:rFonts w:eastAsiaTheme="minorEastAsia"/>
+          <w:rtl/>
+        </w:rPr>
+        <w:t xml:space="preserve"> </w:t>
+      </w:r>
+      <w:r>
+        <w:rPr>
+          <w:rFonts w:eastAsiaTheme="minorEastAsia" w:hint="cs"/>
+          <w:rtl/>
+        </w:rPr>
+        <w:t>ی</w:t>
+      </w:r>
+      <w:r>
+        <w:rPr>
+          <w:rFonts w:eastAsiaTheme="minorEastAsia" w:hint="eastAsia"/>
+          <w:rtl/>
+        </w:rPr>
+        <w:t>ا</w:t>
+      </w:r>
+      <w:r>
+        <w:rPr>
+          <w:rFonts w:eastAsiaTheme="minorEastAsia"/>
+          <w:rtl/>
+        </w:rPr>
+        <w:t xml:space="preserve"> </w:t>
+      </w:r>
+      <w:r>
+        <w:rPr>
+          <w:rFonts w:eastAsiaTheme="minorEastAsia"/>
+        </w:rPr>
+        <w:t>Mine</w:t>
+      </w:r>
+      <w:r>
+        <w:rPr>
+          <w:rFonts w:eastAsiaTheme="minorEastAsia"/>
+          <w:rtl/>
+        </w:rPr>
+        <w:t xml:space="preserve"> استفاده کند.</w:t>
+      </w:r>
+      <w:r>
+        <w:rPr>
+          <w:rFonts w:eastAsiaTheme="minorEastAsia"/>
+          <w:rtl/>
+        </w:rPr>
+        <w:br/>
+      </w:r>
+      <w:r>
+        <w:rPr>
+          <w:rFonts w:eastAsiaTheme="minorEastAsia" w:hint="cs"/>
+          <w:rtl/>
+        </w:rPr>
+        <w:t xml:space="preserve">- </w:t>
+      </w:r>
+      <w:r>
+        <w:rPr>
+          <w:rFonts w:eastAsiaTheme="minorEastAsia" w:hint="cs"/>
+          <w:rtl/>
+        </w:rPr>
+        <w:t xml:space="preserve">از طرفی </w:t>
+      </w:r>
+      <w:r>
+        <w:rPr>
+          <w:rFonts w:eastAsiaTheme="minorEastAsia" w:hint="eastAsia"/>
+          <w:rtl/>
+        </w:rPr>
+        <w:t>فاصله</w:t>
+      </w:r>
+      <w:r>
+        <w:rPr>
+          <w:rFonts w:eastAsiaTheme="minorEastAsia"/>
+          <w:rtl/>
+        </w:rPr>
+        <w:t xml:space="preserve"> ف</w:t>
+      </w:r>
+      <w:r>
+        <w:rPr>
+          <w:rFonts w:eastAsiaTheme="minorEastAsia" w:hint="cs"/>
+          <w:rtl/>
+        </w:rPr>
+        <w:t>ی</w:t>
+      </w:r>
+      <w:r>
+        <w:rPr>
+          <w:rFonts w:eastAsiaTheme="minorEastAsia" w:hint="eastAsia"/>
+          <w:rtl/>
+        </w:rPr>
+        <w:t>ز</w:t>
+      </w:r>
+      <w:r>
+        <w:rPr>
+          <w:rFonts w:eastAsiaTheme="minorEastAsia" w:hint="cs"/>
+          <w:rtl/>
+        </w:rPr>
+        <w:t>ی</w:t>
+      </w:r>
+      <w:r>
+        <w:rPr>
+          <w:rFonts w:eastAsiaTheme="minorEastAsia" w:hint="eastAsia"/>
+          <w:rtl/>
+        </w:rPr>
+        <w:t>ک</w:t>
+      </w:r>
+      <w:r>
+        <w:rPr>
+          <w:rFonts w:eastAsiaTheme="minorEastAsia" w:hint="cs"/>
+          <w:rtl/>
+        </w:rPr>
+        <w:t>ی</w:t>
+      </w:r>
+      <w:r>
+        <w:rPr>
+          <w:rFonts w:eastAsiaTheme="minorEastAsia"/>
+          <w:rtl/>
+        </w:rPr>
+        <w:t xml:space="preserve"> با ضر</w:t>
+      </w:r>
+      <w:r>
+        <w:rPr>
+          <w:rFonts w:eastAsiaTheme="minorEastAsia" w:hint="cs"/>
+          <w:rtl/>
+        </w:rPr>
+        <w:t>ی</w:t>
+      </w:r>
+      <w:r>
+        <w:rPr>
+          <w:rFonts w:eastAsiaTheme="minorEastAsia" w:hint="eastAsia"/>
+          <w:rtl/>
+        </w:rPr>
+        <w:t>ب</w:t>
+      </w:r>
+      <w:r>
+        <w:rPr>
+          <w:rFonts w:eastAsiaTheme="minorEastAsia"/>
+          <w:rtl/>
+        </w:rPr>
+        <w:t xml:space="preserve"> 4- (برا</w:t>
+      </w:r>
+      <w:r>
+        <w:rPr>
+          <w:rFonts w:eastAsiaTheme="minorEastAsia" w:hint="cs"/>
+          <w:rtl/>
+        </w:rPr>
+        <w:t>ی</w:t>
+      </w:r>
+      <w:r>
+        <w:rPr>
+          <w:rFonts w:eastAsiaTheme="minorEastAsia"/>
+          <w:rtl/>
+        </w:rPr>
+        <w:t xml:space="preserve"> جلوگ</w:t>
+      </w:r>
+      <w:r>
+        <w:rPr>
+          <w:rFonts w:eastAsiaTheme="minorEastAsia" w:hint="cs"/>
+          <w:rtl/>
+        </w:rPr>
+        <w:t>ی</w:t>
+      </w:r>
+      <w:r>
+        <w:rPr>
+          <w:rFonts w:eastAsiaTheme="minorEastAsia" w:hint="eastAsia"/>
+          <w:rtl/>
+        </w:rPr>
+        <w:t>ر</w:t>
+      </w:r>
+      <w:r>
+        <w:rPr>
+          <w:rFonts w:eastAsiaTheme="minorEastAsia" w:hint="cs"/>
+          <w:rtl/>
+        </w:rPr>
+        <w:t>ی</w:t>
+      </w:r>
+      <w:r>
+        <w:rPr>
+          <w:rFonts w:eastAsiaTheme="minorEastAsia"/>
+          <w:rtl/>
+        </w:rPr>
+        <w:t xml:space="preserve"> از سرگردان</w:t>
+      </w:r>
+      <w:r>
+        <w:rPr>
+          <w:rFonts w:eastAsiaTheme="minorEastAsia" w:hint="cs"/>
+          <w:rtl/>
+        </w:rPr>
+        <w:t>ی</w:t>
+      </w:r>
+      <w:r>
+        <w:rPr>
+          <w:rFonts w:eastAsiaTheme="minorEastAsia"/>
+          <w:rtl/>
+        </w:rPr>
+        <w:t xml:space="preserve"> ب</w:t>
+      </w:r>
+      <w:r>
+        <w:rPr>
+          <w:rFonts w:eastAsiaTheme="minorEastAsia" w:hint="cs"/>
+          <w:rtl/>
+        </w:rPr>
+        <w:t>ی‌</w:t>
+      </w:r>
+      <w:r>
+        <w:rPr>
+          <w:rFonts w:eastAsiaTheme="minorEastAsia" w:hint="eastAsia"/>
+          <w:rtl/>
+        </w:rPr>
+        <w:t>هدف</w:t>
+      </w:r>
+      <w:r>
+        <w:rPr>
+          <w:rFonts w:eastAsiaTheme="minorEastAsia"/>
+          <w:rtl/>
+        </w:rPr>
+        <w:t xml:space="preserve"> در نقشه) و بونس 26+ برا</w:t>
+      </w:r>
+      <w:r>
+        <w:rPr>
+          <w:rFonts w:eastAsiaTheme="minorEastAsia" w:hint="cs"/>
+          <w:rtl/>
+        </w:rPr>
+        <w:t>ی</w:t>
+      </w:r>
+      <w:r>
+        <w:rPr>
+          <w:rFonts w:eastAsiaTheme="minorEastAsia"/>
+          <w:rtl/>
+        </w:rPr>
+        <w:t xml:space="preserve"> مجاورت با حر</w:t>
+      </w:r>
+      <w:r>
+        <w:rPr>
+          <w:rFonts w:eastAsiaTheme="minorEastAsia" w:hint="cs"/>
+          <w:rtl/>
+        </w:rPr>
+        <w:t>ی</w:t>
+      </w:r>
+      <w:r>
+        <w:rPr>
+          <w:rFonts w:eastAsiaTheme="minorEastAsia" w:hint="eastAsia"/>
+          <w:rtl/>
+        </w:rPr>
+        <w:t>ف</w:t>
+      </w:r>
+      <w:r>
+        <w:rPr>
+          <w:rFonts w:eastAsiaTheme="minorEastAsia"/>
+          <w:rtl/>
+        </w:rPr>
+        <w:t xml:space="preserve"> (تشو</w:t>
+      </w:r>
+      <w:r>
+        <w:rPr>
+          <w:rFonts w:eastAsiaTheme="minorEastAsia" w:hint="cs"/>
+          <w:rtl/>
+        </w:rPr>
+        <w:t>ی</w:t>
+      </w:r>
+      <w:r>
+        <w:rPr>
+          <w:rFonts w:eastAsiaTheme="minorEastAsia" w:hint="eastAsia"/>
+          <w:rtl/>
+        </w:rPr>
+        <w:t>ق</w:t>
+      </w:r>
+      <w:r>
+        <w:rPr>
+          <w:rFonts w:eastAsiaTheme="minorEastAsia"/>
+          <w:rtl/>
+        </w:rPr>
+        <w:t xml:space="preserve"> به </w:t>
+      </w:r>
+      <w:r>
+        <w:rPr>
+          <w:rFonts w:eastAsiaTheme="minorEastAsia"/>
+        </w:rPr>
+        <w:t>Strike</w:t>
+      </w:r>
+      <w:r>
+        <w:rPr>
+          <w:rFonts w:eastAsiaTheme="minorEastAsia"/>
+          <w:rtl/>
+        </w:rPr>
+        <w:t>)</w:t>
+      </w:r>
+      <w:r>
+        <w:rPr>
+          <w:rFonts w:eastAsiaTheme="minorEastAsia" w:hint="cs"/>
+          <w:rtl/>
+        </w:rPr>
+        <w:t xml:space="preserve"> برای عامل وجود دارد</w:t>
+      </w:r>
+      <w:r>
+        <w:rPr>
+          <w:rFonts w:eastAsiaTheme="minorEastAsia"/>
+          <w:rtl/>
+        </w:rPr>
+        <w:t>.</w:t>
+      </w:r>
+      <w:r>
+        <w:rPr>
+          <w:rFonts w:eastAsiaTheme="minorEastAsia"/>
+          <w:rtl/>
+        </w:rPr>
+        <w:br/>
+      </w:r>
+      <w:r>
+        <w:rPr>
+          <w:rFonts w:eastAsiaTheme="minorEastAsia" w:hint="cs"/>
+          <w:rtl/>
+        </w:rPr>
+        <w:t xml:space="preserve">- </w:t>
+      </w:r>
+      <w:r>
+        <w:rPr>
+          <w:rFonts w:eastAsiaTheme="minorEastAsia"/>
+          <w:rtl/>
+        </w:rPr>
+        <w:t>اگر حر</w:t>
+      </w:r>
+      <w:r>
+        <w:rPr>
+          <w:rFonts w:eastAsiaTheme="minorEastAsia" w:hint="cs"/>
+          <w:rtl/>
+        </w:rPr>
+        <w:t>ی</w:t>
+      </w:r>
+      <w:r>
+        <w:rPr>
+          <w:rFonts w:eastAsiaTheme="minorEastAsia" w:hint="eastAsia"/>
+          <w:rtl/>
+        </w:rPr>
+        <w:t>ف</w:t>
+      </w:r>
+      <w:r>
+        <w:rPr>
+          <w:rFonts w:eastAsiaTheme="minorEastAsia"/>
+          <w:rtl/>
+        </w:rPr>
+        <w:t xml:space="preserve"> در خط د</w:t>
+      </w:r>
+      <w:r>
+        <w:rPr>
+          <w:rFonts w:eastAsiaTheme="minorEastAsia" w:hint="cs"/>
+          <w:rtl/>
+        </w:rPr>
+        <w:t>ی</w:t>
+      </w:r>
+      <w:r>
+        <w:rPr>
+          <w:rFonts w:eastAsiaTheme="minorEastAsia" w:hint="eastAsia"/>
+          <w:rtl/>
+        </w:rPr>
+        <w:t>د</w:t>
+      </w:r>
+      <w:r>
+        <w:rPr>
+          <w:rFonts w:eastAsiaTheme="minorEastAsia"/>
+          <w:rtl/>
+        </w:rPr>
+        <w:t xml:space="preserve"> و برد </w:t>
+      </w:r>
+      <w:r>
+        <w:rPr>
+          <w:rFonts w:eastAsiaTheme="minorEastAsia"/>
+        </w:rPr>
+        <w:t>Beam</w:t>
+      </w:r>
+      <w:r>
+        <w:rPr>
+          <w:rFonts w:eastAsiaTheme="minorEastAsia"/>
+          <w:rtl/>
+        </w:rPr>
+        <w:t xml:space="preserve"> باشد و انرژ</w:t>
+      </w:r>
+      <w:r>
+        <w:rPr>
+          <w:rFonts w:eastAsiaTheme="minorEastAsia" w:hint="cs"/>
+          <w:rtl/>
+        </w:rPr>
+        <w:t>ی</w:t>
+      </w:r>
+      <w:r>
+        <w:rPr>
+          <w:rFonts w:eastAsiaTheme="minorEastAsia"/>
+          <w:rtl/>
+        </w:rPr>
+        <w:t xml:space="preserve"> هم داشته باشد، 40- امت</w:t>
+      </w:r>
+      <w:r>
+        <w:rPr>
+          <w:rFonts w:eastAsiaTheme="minorEastAsia" w:hint="cs"/>
+          <w:rtl/>
+        </w:rPr>
+        <w:t>ی</w:t>
+      </w:r>
+      <w:r>
+        <w:rPr>
+          <w:rFonts w:eastAsiaTheme="minorEastAsia" w:hint="eastAsia"/>
+          <w:rtl/>
+        </w:rPr>
+        <w:t>از</w:t>
+      </w:r>
+      <w:r>
+        <w:rPr>
+          <w:rFonts w:eastAsiaTheme="minorEastAsia"/>
+          <w:rtl/>
+        </w:rPr>
+        <w:t>؛ اگر خط د</w:t>
+      </w:r>
+      <w:r>
+        <w:rPr>
+          <w:rFonts w:eastAsiaTheme="minorEastAsia" w:hint="cs"/>
+          <w:rtl/>
+        </w:rPr>
+        <w:t>ی</w:t>
+      </w:r>
+      <w:r>
+        <w:rPr>
+          <w:rFonts w:eastAsiaTheme="minorEastAsia" w:hint="eastAsia"/>
+          <w:rtl/>
+        </w:rPr>
+        <w:t>د</w:t>
+      </w:r>
+      <w:r>
+        <w:rPr>
+          <w:rFonts w:eastAsiaTheme="minorEastAsia"/>
+          <w:rtl/>
+        </w:rPr>
+        <w:t xml:space="preserve"> داشته باشد ول</w:t>
+      </w:r>
+      <w:r>
+        <w:rPr>
+          <w:rFonts w:eastAsiaTheme="minorEastAsia" w:hint="cs"/>
+          <w:rtl/>
+        </w:rPr>
+        <w:t>ی</w:t>
+      </w:r>
+      <w:r>
+        <w:rPr>
+          <w:rFonts w:eastAsiaTheme="minorEastAsia"/>
+          <w:rtl/>
+        </w:rPr>
+        <w:t xml:space="preserve"> انرژ</w:t>
+      </w:r>
+      <w:r>
+        <w:rPr>
+          <w:rFonts w:eastAsiaTheme="minorEastAsia" w:hint="cs"/>
+          <w:rtl/>
+        </w:rPr>
+        <w:t>ی</w:t>
+      </w:r>
+      <w:r>
+        <w:rPr>
+          <w:rFonts w:eastAsiaTheme="minorEastAsia"/>
+          <w:rtl/>
+        </w:rPr>
+        <w:t xml:space="preserve"> نداشته باشد، 34+ امت</w:t>
+      </w:r>
+      <w:r>
+        <w:rPr>
+          <w:rFonts w:eastAsiaTheme="minorEastAsia" w:hint="cs"/>
+          <w:rtl/>
+        </w:rPr>
+        <w:t>ی</w:t>
+      </w:r>
+      <w:r>
+        <w:rPr>
+          <w:rFonts w:eastAsiaTheme="minorEastAsia" w:hint="eastAsia"/>
+          <w:rtl/>
+        </w:rPr>
+        <w:t>از</w:t>
+      </w:r>
+      <w:r>
+        <w:rPr>
+          <w:rFonts w:eastAsiaTheme="minorEastAsia"/>
+          <w:rtl/>
+        </w:rPr>
+        <w:t xml:space="preserve"> (چون تهد</w:t>
+      </w:r>
+      <w:r>
+        <w:rPr>
+          <w:rFonts w:eastAsiaTheme="minorEastAsia" w:hint="cs"/>
+          <w:rtl/>
+        </w:rPr>
+        <w:t>ی</w:t>
+      </w:r>
+      <w:r>
+        <w:rPr>
+          <w:rFonts w:eastAsiaTheme="minorEastAsia" w:hint="eastAsia"/>
+          <w:rtl/>
+        </w:rPr>
+        <w:t>د</w:t>
+      </w:r>
+      <w:r>
+        <w:rPr>
+          <w:rFonts w:eastAsiaTheme="minorEastAsia" w:hint="cs"/>
+          <w:rtl/>
+        </w:rPr>
+        <w:t>ی</w:t>
+      </w:r>
+      <w:r>
+        <w:rPr>
+          <w:rFonts w:eastAsiaTheme="minorEastAsia"/>
+          <w:rtl/>
+        </w:rPr>
+        <w:t xml:space="preserve"> در کار ن</w:t>
+      </w:r>
+      <w:r>
+        <w:rPr>
+          <w:rFonts w:eastAsiaTheme="minorEastAsia" w:hint="cs"/>
+          <w:rtl/>
+        </w:rPr>
+        <w:t>ی</w:t>
+      </w:r>
+      <w:r>
+        <w:rPr>
+          <w:rFonts w:eastAsiaTheme="minorEastAsia" w:hint="eastAsia"/>
+          <w:rtl/>
+        </w:rPr>
+        <w:t>ست</w:t>
+      </w:r>
+      <w:r>
+        <w:rPr>
+          <w:rFonts w:eastAsiaTheme="minorEastAsia"/>
+          <w:rtl/>
+        </w:rPr>
+        <w:t>).</w:t>
+      </w:r>
+      <w:r>
+        <w:rPr>
+          <w:rFonts w:eastAsiaTheme="minorEastAsia"/>
+          <w:rtl/>
+        </w:rPr>
+        <w:br/>
+      </w:r>
+      <w:r>
+        <w:rPr>
+          <w:rFonts w:eastAsiaTheme="minorEastAsia" w:hint="cs"/>
+          <w:rtl/>
+        </w:rPr>
         <w:lastRenderedPageBreak/>
-        <w:t>همانطور که توضیح داده شد، تابع ارزیابی ما یک مجموعه وزن دار از این عوامل است:</w:t>
-      </w:r>
-      <w:r>
-        <w:rPr>
-          <w:rFonts w:eastAsiaTheme="minorEastAsia"/>
-          <w:rtl/>
-        </w:rPr>
-        <w:br/>
-      </w:r>
-      <w:r>
-        <w:rPr>
-          <w:rFonts w:eastAsiaTheme="minorEastAsia" w:hint="cs"/>
-          <w:rtl/>
-        </w:rPr>
-        <w:t xml:space="preserve">- </w:t>
-      </w:r>
-      <w:r>
-        <w:rPr>
-          <w:rFonts w:eastAsiaTheme="minorEastAsia"/>
-          <w:rtl/>
-        </w:rPr>
-        <w:t xml:space="preserve">اختلاف </w:t>
-      </w:r>
-      <w:r>
-        <w:rPr>
-          <w:rFonts w:eastAsiaTheme="minorEastAsia"/>
-        </w:rPr>
-        <w:t>HP</w:t>
-      </w:r>
-      <w:r>
-        <w:rPr>
-          <w:rFonts w:eastAsiaTheme="minorEastAsia"/>
-          <w:rtl/>
-        </w:rPr>
-        <w:t xml:space="preserve"> عامل‌ها با ضر</w:t>
-      </w:r>
-      <w:r>
-        <w:rPr>
-          <w:rFonts w:eastAsiaTheme="minorEastAsia" w:hint="cs"/>
-          <w:rtl/>
-        </w:rPr>
-        <w:t>ی</w:t>
-      </w:r>
-      <w:r>
-        <w:rPr>
-          <w:rFonts w:eastAsiaTheme="minorEastAsia" w:hint="eastAsia"/>
-          <w:rtl/>
-        </w:rPr>
-        <w:t>ب</w:t>
-      </w:r>
-      <w:r>
-        <w:rPr>
-          <w:rFonts w:eastAsiaTheme="minorEastAsia"/>
-          <w:rtl/>
-        </w:rPr>
-        <w:t xml:space="preserve"> 55 (مهم‌تر</w:t>
-      </w:r>
-      <w:r>
-        <w:rPr>
-          <w:rFonts w:eastAsiaTheme="minorEastAsia" w:hint="cs"/>
-          <w:rtl/>
-        </w:rPr>
-        <w:t>ی</w:t>
-      </w:r>
-      <w:r>
-        <w:rPr>
-          <w:rFonts w:eastAsiaTheme="minorEastAsia" w:hint="eastAsia"/>
-          <w:rtl/>
-        </w:rPr>
-        <w:t>ن</w:t>
-      </w:r>
-      <w:r>
-        <w:rPr>
-          <w:rFonts w:eastAsiaTheme="minorEastAsia"/>
-          <w:rtl/>
-        </w:rPr>
-        <w:t xml:space="preserve"> فاکتور)، که ا</w:t>
-      </w:r>
-      <w:r>
-        <w:rPr>
-          <w:rFonts w:eastAsiaTheme="minorEastAsia" w:hint="cs"/>
-          <w:rtl/>
-        </w:rPr>
-        <w:t>ی</w:t>
-      </w:r>
-      <w:r>
-        <w:rPr>
-          <w:rFonts w:eastAsiaTheme="minorEastAsia" w:hint="eastAsia"/>
-          <w:rtl/>
-        </w:rPr>
-        <w:t>ن</w:t>
-      </w:r>
-      <w:r>
-        <w:rPr>
-          <w:rFonts w:eastAsiaTheme="minorEastAsia"/>
-          <w:rtl/>
-        </w:rPr>
-        <w:t xml:space="preserve"> وزن ثابت ن</w:t>
-      </w:r>
-      <w:r>
-        <w:rPr>
-          <w:rFonts w:eastAsiaTheme="minorEastAsia" w:hint="cs"/>
-          <w:rtl/>
-        </w:rPr>
-        <w:t>ی</w:t>
-      </w:r>
-      <w:r>
-        <w:rPr>
-          <w:rFonts w:eastAsiaTheme="minorEastAsia" w:hint="eastAsia"/>
-          <w:rtl/>
-        </w:rPr>
-        <w:t>ست</w:t>
-      </w:r>
-      <w:r>
-        <w:rPr>
-          <w:rFonts w:eastAsiaTheme="minorEastAsia"/>
-          <w:rtl/>
-        </w:rPr>
-        <w:t xml:space="preserve"> و هر زمان جان </w:t>
-      </w:r>
-      <w:r>
-        <w:rPr>
-          <w:rFonts w:eastAsiaTheme="minorEastAsia" w:hint="cs"/>
-          <w:rtl/>
-        </w:rPr>
-        <w:t>ی</w:t>
-      </w:r>
-      <w:r>
-        <w:rPr>
-          <w:rFonts w:eastAsiaTheme="minorEastAsia" w:hint="eastAsia"/>
-          <w:rtl/>
-        </w:rPr>
-        <w:t>ک</w:t>
-      </w:r>
-      <w:r>
-        <w:rPr>
-          <w:rFonts w:eastAsiaTheme="minorEastAsia" w:hint="cs"/>
-          <w:rtl/>
-        </w:rPr>
-        <w:t>ی</w:t>
-      </w:r>
-      <w:r>
-        <w:rPr>
-          <w:rFonts w:eastAsiaTheme="minorEastAsia"/>
-          <w:rtl/>
-        </w:rPr>
-        <w:t xml:space="preserve"> از دو </w:t>
-      </w:r>
-      <w:r>
-        <w:rPr>
-          <w:rFonts w:eastAsiaTheme="minorEastAsia" w:hint="cs"/>
-          <w:rtl/>
-        </w:rPr>
-        <w:t xml:space="preserve">عامل </w:t>
-      </w:r>
-      <w:r>
-        <w:rPr>
-          <w:rFonts w:eastAsiaTheme="minorEastAsia"/>
-          <w:rtl/>
-        </w:rPr>
-        <w:t>به کمتر از 6 برسد، اثر آن ب</w:t>
-      </w:r>
-      <w:r>
-        <w:rPr>
-          <w:rFonts w:eastAsiaTheme="minorEastAsia" w:hint="cs"/>
-          <w:rtl/>
-        </w:rPr>
-        <w:t>ی</w:t>
-      </w:r>
-      <w:r>
-        <w:rPr>
-          <w:rFonts w:eastAsiaTheme="minorEastAsia" w:hint="eastAsia"/>
-          <w:rtl/>
-        </w:rPr>
-        <w:t>شتر</w:t>
-      </w:r>
-      <w:r>
-        <w:rPr>
-          <w:rFonts w:eastAsiaTheme="minorEastAsia"/>
-          <w:rtl/>
-        </w:rPr>
-        <w:t xml:space="preserve"> م</w:t>
-      </w:r>
-      <w:r>
-        <w:rPr>
-          <w:rFonts w:eastAsiaTheme="minorEastAsia" w:hint="cs"/>
-          <w:rtl/>
-        </w:rPr>
-        <w:t>ی‌</w:t>
-      </w:r>
-      <w:r>
-        <w:rPr>
-          <w:rFonts w:eastAsiaTheme="minorEastAsia" w:hint="eastAsia"/>
-          <w:rtl/>
-        </w:rPr>
-        <w:t>شود</w:t>
-      </w:r>
-      <w:r>
-        <w:rPr>
-          <w:rFonts w:eastAsiaTheme="minorEastAsia"/>
-          <w:rtl/>
-        </w:rPr>
-        <w:t xml:space="preserve"> تا الگور</w:t>
-      </w:r>
-      <w:r>
-        <w:rPr>
-          <w:rFonts w:eastAsiaTheme="minorEastAsia" w:hint="cs"/>
-          <w:rtl/>
-        </w:rPr>
-        <w:t>ی</w:t>
-      </w:r>
-      <w:r>
-        <w:rPr>
-          <w:rFonts w:eastAsiaTheme="minorEastAsia" w:hint="eastAsia"/>
-          <w:rtl/>
-        </w:rPr>
-        <w:t>تم</w:t>
-      </w:r>
-      <w:r>
-        <w:rPr>
-          <w:rFonts w:eastAsiaTheme="minorEastAsia"/>
-          <w:rtl/>
-        </w:rPr>
-        <w:t xml:space="preserve"> ب</w:t>
-      </w:r>
-      <w:r>
-        <w:rPr>
-          <w:rFonts w:eastAsiaTheme="minorEastAsia" w:hint="cs"/>
-          <w:rtl/>
-        </w:rPr>
-        <w:t>ی</w:t>
-      </w:r>
-      <w:r>
-        <w:rPr>
-          <w:rFonts w:eastAsiaTheme="minorEastAsia" w:hint="eastAsia"/>
-          <w:rtl/>
-        </w:rPr>
-        <w:t>ن</w:t>
-      </w:r>
-      <w:r>
-        <w:rPr>
-          <w:rFonts w:eastAsiaTheme="minorEastAsia"/>
-          <w:rtl/>
-        </w:rPr>
-        <w:t xml:space="preserve"> حالت عاد</w:t>
-      </w:r>
-      <w:r>
-        <w:rPr>
-          <w:rFonts w:eastAsiaTheme="minorEastAsia" w:hint="cs"/>
-          <w:rtl/>
-        </w:rPr>
-        <w:t>ی</w:t>
-      </w:r>
-      <w:r>
-        <w:rPr>
-          <w:rFonts w:eastAsiaTheme="minorEastAsia"/>
-          <w:rtl/>
-        </w:rPr>
-        <w:t xml:space="preserve"> و حالت بحران</w:t>
-      </w:r>
-      <w:r>
-        <w:rPr>
-          <w:rFonts w:eastAsiaTheme="minorEastAsia" w:hint="cs"/>
-          <w:rtl/>
-        </w:rPr>
-        <w:t>ی</w:t>
-      </w:r>
-      <w:r>
-        <w:rPr>
-          <w:rFonts w:eastAsiaTheme="minorEastAsia" w:hint="cs"/>
-          <w:rtl/>
-        </w:rPr>
-        <w:t xml:space="preserve"> </w:t>
-      </w:r>
-      <w:r>
-        <w:rPr>
-          <w:rFonts w:eastAsiaTheme="minorEastAsia"/>
-          <w:rtl/>
-        </w:rPr>
-        <w:t>تما</w:t>
-      </w:r>
-      <w:r>
-        <w:rPr>
-          <w:rFonts w:eastAsiaTheme="minorEastAsia" w:hint="cs"/>
-          <w:rtl/>
-        </w:rPr>
-        <w:t>ی</w:t>
-      </w:r>
-      <w:r>
-        <w:rPr>
-          <w:rFonts w:eastAsiaTheme="minorEastAsia" w:hint="eastAsia"/>
-          <w:rtl/>
-        </w:rPr>
-        <w:t>ز</w:t>
-      </w:r>
-      <w:r>
-        <w:rPr>
-          <w:rFonts w:eastAsiaTheme="minorEastAsia"/>
-          <w:rtl/>
-        </w:rPr>
-        <w:t xml:space="preserve"> قائل شود.</w:t>
-      </w:r>
-      <w:r>
-        <w:rPr>
-          <w:rFonts w:eastAsiaTheme="minorEastAsia"/>
-          <w:rtl/>
-        </w:rPr>
-        <w:br/>
-      </w:r>
-      <w:r>
-        <w:rPr>
-          <w:rFonts w:eastAsiaTheme="minorEastAsia" w:hint="cs"/>
-          <w:rtl/>
-        </w:rPr>
-        <w:t xml:space="preserve">- </w:t>
-      </w:r>
-      <w:r>
-        <w:rPr>
-          <w:rFonts w:eastAsiaTheme="minorEastAsia" w:hint="eastAsia"/>
-          <w:rtl/>
-        </w:rPr>
-        <w:t>تفاوت</w:t>
-      </w:r>
-      <w:r>
-        <w:rPr>
-          <w:rFonts w:eastAsiaTheme="minorEastAsia"/>
-          <w:rtl/>
-        </w:rPr>
-        <w:t xml:space="preserve"> مقدار انرژ</w:t>
-      </w:r>
-      <w:r>
-        <w:rPr>
-          <w:rFonts w:eastAsiaTheme="minorEastAsia" w:hint="cs"/>
-          <w:rtl/>
-        </w:rPr>
-        <w:t>ی</w:t>
-      </w:r>
-      <w:r>
-        <w:rPr>
-          <w:rFonts w:eastAsiaTheme="minorEastAsia"/>
-          <w:rtl/>
-        </w:rPr>
-        <w:t xml:space="preserve"> عامل‌ها با ضر</w:t>
-      </w:r>
-      <w:r>
-        <w:rPr>
-          <w:rFonts w:eastAsiaTheme="minorEastAsia" w:hint="cs"/>
-          <w:rtl/>
-        </w:rPr>
-        <w:t>ی</w:t>
-      </w:r>
-      <w:r>
-        <w:rPr>
-          <w:rFonts w:eastAsiaTheme="minorEastAsia" w:hint="eastAsia"/>
-          <w:rtl/>
-        </w:rPr>
-        <w:t>ب</w:t>
-      </w:r>
-      <w:r>
-        <w:rPr>
-          <w:rFonts w:eastAsiaTheme="minorEastAsia"/>
-          <w:rtl/>
-        </w:rPr>
-        <w:t xml:space="preserve"> 12، که عامل را به جا</w:t>
-      </w:r>
-      <w:r>
-        <w:rPr>
-          <w:rFonts w:eastAsiaTheme="minorEastAsia" w:hint="cs"/>
-          <w:rtl/>
-        </w:rPr>
-        <w:t>ی</w:t>
-      </w:r>
-      <w:r>
-        <w:rPr>
-          <w:rFonts w:eastAsiaTheme="minorEastAsia"/>
-          <w:rtl/>
-        </w:rPr>
-        <w:t xml:space="preserve"> حرکت ب</w:t>
-      </w:r>
-      <w:r>
-        <w:rPr>
-          <w:rFonts w:eastAsiaTheme="minorEastAsia" w:hint="cs"/>
-          <w:rtl/>
-        </w:rPr>
-        <w:t>ی‌</w:t>
-      </w:r>
-      <w:r>
-        <w:rPr>
-          <w:rFonts w:eastAsiaTheme="minorEastAsia" w:hint="eastAsia"/>
-          <w:rtl/>
-        </w:rPr>
-        <w:t>هدف،</w:t>
-      </w:r>
-      <w:r>
-        <w:rPr>
-          <w:rFonts w:eastAsiaTheme="minorEastAsia"/>
-          <w:rtl/>
-        </w:rPr>
-        <w:t xml:space="preserve"> به ذخ</w:t>
-      </w:r>
-      <w:r>
-        <w:rPr>
-          <w:rFonts w:eastAsiaTheme="minorEastAsia" w:hint="cs"/>
-          <w:rtl/>
-        </w:rPr>
-        <w:t>ی</w:t>
-      </w:r>
-      <w:r>
-        <w:rPr>
-          <w:rFonts w:eastAsiaTheme="minorEastAsia" w:hint="eastAsia"/>
-          <w:rtl/>
-        </w:rPr>
-        <w:t>ره</w:t>
-      </w:r>
-      <w:r>
-        <w:rPr>
-          <w:rFonts w:eastAsiaTheme="minorEastAsia"/>
-          <w:rtl/>
-        </w:rPr>
-        <w:t xml:space="preserve"> انرژ</w:t>
-      </w:r>
-      <w:r>
-        <w:rPr>
-          <w:rFonts w:eastAsiaTheme="minorEastAsia" w:hint="cs"/>
-          <w:rtl/>
-        </w:rPr>
-        <w:t>ی</w:t>
-      </w:r>
-      <w:r>
-        <w:rPr>
-          <w:rFonts w:eastAsiaTheme="minorEastAsia"/>
-          <w:rtl/>
-        </w:rPr>
-        <w:t xml:space="preserve"> (اکشن </w:t>
-      </w:r>
-      <w:r>
-        <w:rPr>
-          <w:rFonts w:eastAsiaTheme="minorEastAsia"/>
-        </w:rPr>
-        <w:t>Wait</w:t>
-      </w:r>
-      <w:r>
-        <w:rPr>
-          <w:rFonts w:eastAsiaTheme="minorEastAsia"/>
-          <w:rtl/>
-        </w:rPr>
-        <w:t>) در زمان امن ترغ</w:t>
-      </w:r>
-      <w:r>
-        <w:rPr>
-          <w:rFonts w:eastAsiaTheme="minorEastAsia" w:hint="cs"/>
-          <w:rtl/>
-        </w:rPr>
-        <w:t>ی</w:t>
-      </w:r>
-      <w:r>
-        <w:rPr>
-          <w:rFonts w:eastAsiaTheme="minorEastAsia" w:hint="eastAsia"/>
-          <w:rtl/>
-        </w:rPr>
-        <w:t>ب</w:t>
-      </w:r>
-      <w:r>
-        <w:rPr>
-          <w:rFonts w:eastAsiaTheme="minorEastAsia"/>
-          <w:rtl/>
-        </w:rPr>
-        <w:t xml:space="preserve"> م</w:t>
-      </w:r>
-      <w:r>
-        <w:rPr>
-          <w:rFonts w:eastAsiaTheme="minorEastAsia" w:hint="cs"/>
-          <w:rtl/>
-        </w:rPr>
-        <w:t>ی‌</w:t>
-      </w:r>
-      <w:r>
-        <w:rPr>
-          <w:rFonts w:eastAsiaTheme="minorEastAsia" w:hint="eastAsia"/>
-          <w:rtl/>
-        </w:rPr>
-        <w:t>کند</w:t>
-      </w:r>
-      <w:r>
-        <w:rPr>
-          <w:rFonts w:eastAsiaTheme="minorEastAsia"/>
-          <w:rtl/>
-        </w:rPr>
-        <w:t xml:space="preserve"> تا بتواند از </w:t>
-      </w:r>
-      <w:r>
-        <w:rPr>
-          <w:rFonts w:eastAsiaTheme="minorEastAsia"/>
-        </w:rPr>
-        <w:t>Beam</w:t>
-      </w:r>
-      <w:r>
-        <w:rPr>
-          <w:rFonts w:eastAsiaTheme="minorEastAsia"/>
-          <w:rtl/>
-        </w:rPr>
-        <w:t xml:space="preserve"> </w:t>
-      </w:r>
-      <w:r>
-        <w:rPr>
-          <w:rFonts w:eastAsiaTheme="minorEastAsia" w:hint="cs"/>
-          <w:rtl/>
-        </w:rPr>
-        <w:t>ی</w:t>
-      </w:r>
-      <w:r>
-        <w:rPr>
-          <w:rFonts w:eastAsiaTheme="minorEastAsia" w:hint="eastAsia"/>
-          <w:rtl/>
-        </w:rPr>
-        <w:t>ا</w:t>
-      </w:r>
-      <w:r>
-        <w:rPr>
-          <w:rFonts w:eastAsiaTheme="minorEastAsia"/>
-          <w:rtl/>
-        </w:rPr>
-        <w:t xml:space="preserve"> </w:t>
-      </w:r>
-      <w:r>
-        <w:rPr>
-          <w:rFonts w:eastAsiaTheme="minorEastAsia"/>
-        </w:rPr>
-        <w:t>Mine</w:t>
-      </w:r>
-      <w:r>
-        <w:rPr>
-          <w:rFonts w:eastAsiaTheme="minorEastAsia"/>
-          <w:rtl/>
-        </w:rPr>
-        <w:t xml:space="preserve"> استفاده کند.</w:t>
-      </w:r>
-      <w:r>
-        <w:rPr>
-          <w:rFonts w:eastAsiaTheme="minorEastAsia"/>
-          <w:rtl/>
-        </w:rPr>
-        <w:br/>
-      </w:r>
-      <w:r>
-        <w:rPr>
-          <w:rFonts w:eastAsiaTheme="minorEastAsia" w:hint="cs"/>
-          <w:rtl/>
-        </w:rPr>
-        <w:t xml:space="preserve">- </w:t>
-      </w:r>
-      <w:r>
-        <w:rPr>
-          <w:rFonts w:eastAsiaTheme="minorEastAsia" w:hint="cs"/>
-          <w:rtl/>
-        </w:rPr>
-        <w:t xml:space="preserve">از طرفی </w:t>
-      </w:r>
-      <w:r>
-        <w:rPr>
-          <w:rFonts w:eastAsiaTheme="minorEastAsia" w:hint="eastAsia"/>
-          <w:rtl/>
-        </w:rPr>
-        <w:t>فاصله</w:t>
-      </w:r>
-      <w:r>
-        <w:rPr>
-          <w:rFonts w:eastAsiaTheme="minorEastAsia"/>
-          <w:rtl/>
-        </w:rPr>
-        <w:t xml:space="preserve"> ف</w:t>
-      </w:r>
-      <w:r>
-        <w:rPr>
-          <w:rFonts w:eastAsiaTheme="minorEastAsia" w:hint="cs"/>
-          <w:rtl/>
-        </w:rPr>
-        <w:t>ی</w:t>
-      </w:r>
-      <w:r>
-        <w:rPr>
-          <w:rFonts w:eastAsiaTheme="minorEastAsia" w:hint="eastAsia"/>
-          <w:rtl/>
-        </w:rPr>
-        <w:t>ز</w:t>
-      </w:r>
-      <w:r>
-        <w:rPr>
-          <w:rFonts w:eastAsiaTheme="minorEastAsia" w:hint="cs"/>
-          <w:rtl/>
-        </w:rPr>
-        <w:t>ی</w:t>
-      </w:r>
-      <w:r>
-        <w:rPr>
-          <w:rFonts w:eastAsiaTheme="minorEastAsia" w:hint="eastAsia"/>
-          <w:rtl/>
-        </w:rPr>
-        <w:t>ک</w:t>
-      </w:r>
-      <w:r>
-        <w:rPr>
-          <w:rFonts w:eastAsiaTheme="minorEastAsia" w:hint="cs"/>
-          <w:rtl/>
-        </w:rPr>
-        <w:t>ی</w:t>
-      </w:r>
-      <w:r>
-        <w:rPr>
-          <w:rFonts w:eastAsiaTheme="minorEastAsia"/>
-          <w:rtl/>
-        </w:rPr>
-        <w:t xml:space="preserve"> با ضر</w:t>
-      </w:r>
-      <w:r>
-        <w:rPr>
-          <w:rFonts w:eastAsiaTheme="minorEastAsia" w:hint="cs"/>
-          <w:rtl/>
-        </w:rPr>
-        <w:t>ی</w:t>
-      </w:r>
-      <w:r>
-        <w:rPr>
-          <w:rFonts w:eastAsiaTheme="minorEastAsia" w:hint="eastAsia"/>
-          <w:rtl/>
-        </w:rPr>
-        <w:t>ب</w:t>
-      </w:r>
-      <w:r>
-        <w:rPr>
-          <w:rFonts w:eastAsiaTheme="minorEastAsia"/>
-          <w:rtl/>
-        </w:rPr>
-        <w:t xml:space="preserve"> 4- (برا</w:t>
-      </w:r>
-      <w:r>
-        <w:rPr>
-          <w:rFonts w:eastAsiaTheme="minorEastAsia" w:hint="cs"/>
-          <w:rtl/>
-        </w:rPr>
-        <w:t>ی</w:t>
-      </w:r>
-      <w:r>
-        <w:rPr>
-          <w:rFonts w:eastAsiaTheme="minorEastAsia"/>
-          <w:rtl/>
-        </w:rPr>
-        <w:t xml:space="preserve"> جلوگ</w:t>
-      </w:r>
-      <w:r>
-        <w:rPr>
-          <w:rFonts w:eastAsiaTheme="minorEastAsia" w:hint="cs"/>
-          <w:rtl/>
-        </w:rPr>
-        <w:t>ی</w:t>
-      </w:r>
-      <w:r>
-        <w:rPr>
-          <w:rFonts w:eastAsiaTheme="minorEastAsia" w:hint="eastAsia"/>
-          <w:rtl/>
-        </w:rPr>
-        <w:t>ر</w:t>
-      </w:r>
-      <w:r>
-        <w:rPr>
-          <w:rFonts w:eastAsiaTheme="minorEastAsia" w:hint="cs"/>
-          <w:rtl/>
-        </w:rPr>
-        <w:t>ی</w:t>
-      </w:r>
-      <w:r>
-        <w:rPr>
-          <w:rFonts w:eastAsiaTheme="minorEastAsia"/>
-          <w:rtl/>
-        </w:rPr>
-        <w:t xml:space="preserve"> از سرگردان</w:t>
-      </w:r>
-      <w:r>
-        <w:rPr>
-          <w:rFonts w:eastAsiaTheme="minorEastAsia" w:hint="cs"/>
-          <w:rtl/>
-        </w:rPr>
-        <w:t>ی</w:t>
-      </w:r>
-      <w:r>
-        <w:rPr>
-          <w:rFonts w:eastAsiaTheme="minorEastAsia"/>
-          <w:rtl/>
-        </w:rPr>
-        <w:t xml:space="preserve"> ب</w:t>
-      </w:r>
-      <w:r>
-        <w:rPr>
-          <w:rFonts w:eastAsiaTheme="minorEastAsia" w:hint="cs"/>
-          <w:rtl/>
-        </w:rPr>
-        <w:t>ی‌</w:t>
-      </w:r>
-      <w:r>
-        <w:rPr>
-          <w:rFonts w:eastAsiaTheme="minorEastAsia" w:hint="eastAsia"/>
-          <w:rtl/>
-        </w:rPr>
-        <w:t>هدف</w:t>
-      </w:r>
-      <w:r>
-        <w:rPr>
-          <w:rFonts w:eastAsiaTheme="minorEastAsia"/>
-          <w:rtl/>
-        </w:rPr>
-        <w:t xml:space="preserve"> در نقشه) و بونس 26+ برا</w:t>
-      </w:r>
-      <w:r>
-        <w:rPr>
-          <w:rFonts w:eastAsiaTheme="minorEastAsia" w:hint="cs"/>
-          <w:rtl/>
-        </w:rPr>
-        <w:t>ی</w:t>
-      </w:r>
-      <w:r>
-        <w:rPr>
-          <w:rFonts w:eastAsiaTheme="minorEastAsia"/>
-          <w:rtl/>
-        </w:rPr>
-        <w:t xml:space="preserve"> مجاورت با حر</w:t>
-      </w:r>
-      <w:r>
-        <w:rPr>
-          <w:rFonts w:eastAsiaTheme="minorEastAsia" w:hint="cs"/>
-          <w:rtl/>
-        </w:rPr>
-        <w:t>ی</w:t>
-      </w:r>
-      <w:r>
-        <w:rPr>
-          <w:rFonts w:eastAsiaTheme="minorEastAsia" w:hint="eastAsia"/>
-          <w:rtl/>
-        </w:rPr>
-        <w:t>ف</w:t>
-      </w:r>
-      <w:r>
-        <w:rPr>
-          <w:rFonts w:eastAsiaTheme="minorEastAsia"/>
-          <w:rtl/>
-        </w:rPr>
-        <w:t xml:space="preserve"> (تشو</w:t>
-      </w:r>
-      <w:r>
-        <w:rPr>
-          <w:rFonts w:eastAsiaTheme="minorEastAsia" w:hint="cs"/>
-          <w:rtl/>
-        </w:rPr>
-        <w:t>ی</w:t>
-      </w:r>
-      <w:r>
-        <w:rPr>
-          <w:rFonts w:eastAsiaTheme="minorEastAsia" w:hint="eastAsia"/>
-          <w:rtl/>
-        </w:rPr>
-        <w:t>ق</w:t>
-      </w:r>
-      <w:r>
-        <w:rPr>
-          <w:rFonts w:eastAsiaTheme="minorEastAsia"/>
-          <w:rtl/>
-        </w:rPr>
-        <w:t xml:space="preserve"> به </w:t>
-      </w:r>
-      <w:r>
-        <w:rPr>
-          <w:rFonts w:eastAsiaTheme="minorEastAsia"/>
-        </w:rPr>
-        <w:t>Strike</w:t>
-      </w:r>
-      <w:r>
-        <w:rPr>
-          <w:rFonts w:eastAsiaTheme="minorEastAsia"/>
-          <w:rtl/>
-        </w:rPr>
-        <w:t>)</w:t>
-      </w:r>
-      <w:r>
-        <w:rPr>
-          <w:rFonts w:eastAsiaTheme="minorEastAsia" w:hint="cs"/>
-          <w:rtl/>
-        </w:rPr>
-        <w:t xml:space="preserve"> برای عامل وجود دارد</w:t>
-      </w:r>
-      <w:r>
-        <w:rPr>
-          <w:rFonts w:eastAsiaTheme="minorEastAsia"/>
-          <w:rtl/>
-        </w:rPr>
-        <w:t>.</w:t>
-      </w:r>
-      <w:r>
-        <w:rPr>
-          <w:rFonts w:eastAsiaTheme="minorEastAsia"/>
-          <w:rtl/>
-        </w:rPr>
-        <w:br/>
-      </w:r>
-      <w:r>
-        <w:rPr>
-          <w:rFonts w:eastAsiaTheme="minorEastAsia" w:hint="cs"/>
-          <w:rtl/>
-        </w:rPr>
-        <w:t xml:space="preserve">- </w:t>
-      </w:r>
-      <w:r>
-        <w:rPr>
-          <w:rFonts w:eastAsiaTheme="minorEastAsia"/>
-          <w:rtl/>
-        </w:rPr>
-        <w:t>اگر حر</w:t>
-      </w:r>
-      <w:r>
-        <w:rPr>
-          <w:rFonts w:eastAsiaTheme="minorEastAsia" w:hint="cs"/>
-          <w:rtl/>
-        </w:rPr>
-        <w:t>ی</w:t>
-      </w:r>
-      <w:r>
-        <w:rPr>
-          <w:rFonts w:eastAsiaTheme="minorEastAsia" w:hint="eastAsia"/>
-          <w:rtl/>
-        </w:rPr>
-        <w:t>ف</w:t>
-      </w:r>
-      <w:r>
-        <w:rPr>
-          <w:rFonts w:eastAsiaTheme="minorEastAsia"/>
-          <w:rtl/>
-        </w:rPr>
-        <w:t xml:space="preserve"> در خط د</w:t>
-      </w:r>
-      <w:r>
-        <w:rPr>
-          <w:rFonts w:eastAsiaTheme="minorEastAsia" w:hint="cs"/>
-          <w:rtl/>
-        </w:rPr>
-        <w:t>ی</w:t>
-      </w:r>
-      <w:r>
-        <w:rPr>
-          <w:rFonts w:eastAsiaTheme="minorEastAsia" w:hint="eastAsia"/>
-          <w:rtl/>
-        </w:rPr>
-        <w:t>د</w:t>
-      </w:r>
-      <w:r>
-        <w:rPr>
-          <w:rFonts w:eastAsiaTheme="minorEastAsia"/>
-          <w:rtl/>
-        </w:rPr>
-        <w:t xml:space="preserve"> و برد </w:t>
-      </w:r>
-      <w:r>
-        <w:rPr>
-          <w:rFonts w:eastAsiaTheme="minorEastAsia"/>
-        </w:rPr>
-        <w:t>Beam</w:t>
-      </w:r>
-      <w:r>
-        <w:rPr>
-          <w:rFonts w:eastAsiaTheme="minorEastAsia"/>
-          <w:rtl/>
-        </w:rPr>
-        <w:t xml:space="preserve"> باشد و انرژ</w:t>
-      </w:r>
-      <w:r>
-        <w:rPr>
-          <w:rFonts w:eastAsiaTheme="minorEastAsia" w:hint="cs"/>
-          <w:rtl/>
-        </w:rPr>
-        <w:t>ی</w:t>
-      </w:r>
-      <w:r>
-        <w:rPr>
-          <w:rFonts w:eastAsiaTheme="minorEastAsia"/>
-          <w:rtl/>
-        </w:rPr>
-        <w:t xml:space="preserve"> هم داشته باشد، 40- امت</w:t>
-      </w:r>
-      <w:r>
-        <w:rPr>
-          <w:rFonts w:eastAsiaTheme="minorEastAsia" w:hint="cs"/>
-          <w:rtl/>
-        </w:rPr>
-        <w:t>ی</w:t>
-      </w:r>
-      <w:r>
-        <w:rPr>
-          <w:rFonts w:eastAsiaTheme="minorEastAsia" w:hint="eastAsia"/>
-          <w:rtl/>
-        </w:rPr>
-        <w:t>از</w:t>
-      </w:r>
-      <w:r>
-        <w:rPr>
-          <w:rFonts w:eastAsiaTheme="minorEastAsia"/>
-          <w:rtl/>
-        </w:rPr>
-        <w:t>؛ اگر خط د</w:t>
-      </w:r>
-      <w:r>
-        <w:rPr>
-          <w:rFonts w:eastAsiaTheme="minorEastAsia" w:hint="cs"/>
-          <w:rtl/>
-        </w:rPr>
-        <w:t>ی</w:t>
-      </w:r>
-      <w:r>
-        <w:rPr>
-          <w:rFonts w:eastAsiaTheme="minorEastAsia" w:hint="eastAsia"/>
-          <w:rtl/>
-        </w:rPr>
-        <w:t>د</w:t>
-      </w:r>
-      <w:r>
-        <w:rPr>
-          <w:rFonts w:eastAsiaTheme="minorEastAsia"/>
-          <w:rtl/>
-        </w:rPr>
-        <w:t xml:space="preserve"> داشته باشد ول</w:t>
-      </w:r>
-      <w:r>
-        <w:rPr>
-          <w:rFonts w:eastAsiaTheme="minorEastAsia" w:hint="cs"/>
-          <w:rtl/>
-        </w:rPr>
-        <w:t>ی</w:t>
-      </w:r>
-      <w:r>
-        <w:rPr>
-          <w:rFonts w:eastAsiaTheme="minorEastAsia"/>
-          <w:rtl/>
-        </w:rPr>
-        <w:t xml:space="preserve"> انرژ</w:t>
-      </w:r>
-      <w:r>
-        <w:rPr>
-          <w:rFonts w:eastAsiaTheme="minorEastAsia" w:hint="cs"/>
-          <w:rtl/>
-        </w:rPr>
-        <w:t>ی</w:t>
-      </w:r>
-      <w:r>
-        <w:rPr>
-          <w:rFonts w:eastAsiaTheme="minorEastAsia"/>
-          <w:rtl/>
-        </w:rPr>
-        <w:t xml:space="preserve"> نداشته باشد، 34+ امت</w:t>
-      </w:r>
-      <w:r>
-        <w:rPr>
-          <w:rFonts w:eastAsiaTheme="minorEastAsia" w:hint="cs"/>
-          <w:rtl/>
-        </w:rPr>
-        <w:t>ی</w:t>
-      </w:r>
-      <w:r>
-        <w:rPr>
-          <w:rFonts w:eastAsiaTheme="minorEastAsia" w:hint="eastAsia"/>
-          <w:rtl/>
-        </w:rPr>
-        <w:t>از</w:t>
-      </w:r>
-      <w:r>
-        <w:rPr>
-          <w:rFonts w:eastAsiaTheme="minorEastAsia"/>
-          <w:rtl/>
-        </w:rPr>
-        <w:t xml:space="preserve"> (چون تهد</w:t>
-      </w:r>
-      <w:r>
-        <w:rPr>
-          <w:rFonts w:eastAsiaTheme="minorEastAsia" w:hint="cs"/>
-          <w:rtl/>
-        </w:rPr>
-        <w:t>ی</w:t>
-      </w:r>
-      <w:r>
-        <w:rPr>
-          <w:rFonts w:eastAsiaTheme="minorEastAsia" w:hint="eastAsia"/>
-          <w:rtl/>
-        </w:rPr>
-        <w:t>د</w:t>
-      </w:r>
-      <w:r>
-        <w:rPr>
-          <w:rFonts w:eastAsiaTheme="minorEastAsia" w:hint="cs"/>
-          <w:rtl/>
-        </w:rPr>
-        <w:t>ی</w:t>
-      </w:r>
-      <w:r>
-        <w:rPr>
-          <w:rFonts w:eastAsiaTheme="minorEastAsia"/>
-          <w:rtl/>
-        </w:rPr>
-        <w:t xml:space="preserve"> در کار ن</w:t>
-      </w:r>
-      <w:r>
-        <w:rPr>
-          <w:rFonts w:eastAsiaTheme="minorEastAsia" w:hint="cs"/>
-          <w:rtl/>
-        </w:rPr>
-        <w:t>ی</w:t>
-      </w:r>
-      <w:r>
-        <w:rPr>
-          <w:rFonts w:eastAsiaTheme="minorEastAsia" w:hint="eastAsia"/>
-          <w:rtl/>
-        </w:rPr>
-        <w:t>ست</w:t>
-      </w:r>
-      <w:r>
-        <w:rPr>
-          <w:rFonts w:eastAsiaTheme="minorEastAsia"/>
-          <w:rtl/>
-        </w:rPr>
-        <w:t>).</w:t>
-      </w:r>
-      <w:r>
-        <w:rPr>
-          <w:rFonts w:eastAsiaTheme="minorEastAsia"/>
-          <w:rtl/>
-        </w:rPr>
-        <w:br/>
-      </w:r>
-      <w:r>
-        <w:rPr>
-          <w:rFonts w:eastAsiaTheme="minorEastAsia" w:hint="cs"/>
-          <w:rtl/>
-        </w:rPr>
         <w:t xml:space="preserve">- </w:t>
       </w:r>
       <w:r>
@@ -6834,288 +7370,289 @@
         <w:rPr>
           <w:rFonts w:eastAsiaTheme="minorEastAsia"/>
         </w:rPr>
+        <w:t>Alpha-Beta</w:t>
+      </w:r>
+      <w:r>
+        <w:rPr>
+          <w:rFonts w:eastAsiaTheme="minorEastAsia"/>
+          <w:rtl/>
+        </w:rPr>
+        <w:t xml:space="preserve"> همان درخت تصمیمی را که </w:t>
+      </w:r>
+      <w:r>
+        <w:rPr>
+          <w:rFonts w:eastAsiaTheme="minorEastAsia"/>
+        </w:rPr>
+        <w:t>Minimax</w:t>
+      </w:r>
+      <w:r>
+        <w:rPr>
+          <w:rFonts w:eastAsiaTheme="minorEastAsia"/>
+          <w:rtl/>
+        </w:rPr>
+        <w:t xml:space="preserve"> می‌بیند بررسی می‌کند، با این تفاوت که در حین جست‌وجو دو مقدار </w:t>
+      </w:r>
+      <w:r>
+        <w:rPr>
+          <w:rFonts w:eastAsiaTheme="minorEastAsia"/>
+        </w:rPr>
+        <w:t>α</w:t>
+      </w:r>
+      <w:r>
+        <w:rPr>
+          <w:rFonts w:eastAsiaTheme="minorEastAsia"/>
+          <w:rtl/>
+        </w:rPr>
+        <w:t xml:space="preserve"> (بهترین گزینه‌ی</w:t>
+      </w:r>
+      <w:r>
+        <w:rPr>
+          <w:rFonts w:eastAsiaTheme="minorEastAsia" w:hint="cs"/>
+          <w:rtl/>
+        </w:rPr>
+        <w:t xml:space="preserve"> </w:t>
+      </w:r>
+      <w:r>
+        <w:rPr>
+          <w:rFonts w:eastAsiaTheme="minorEastAsia"/>
+        </w:rPr>
+        <w:t>Max</w:t>
+      </w:r>
+      <w:r>
+        <w:rPr>
+          <w:rFonts w:eastAsiaTheme="minorEastAsia"/>
+          <w:rtl/>
+        </w:rPr>
+        <w:t xml:space="preserve">) و </w:t>
+      </w:r>
+      <w:r>
+        <w:rPr>
+          <w:rFonts w:eastAsiaTheme="minorEastAsia"/>
+        </w:rPr>
+        <w:t>β</w:t>
+      </w:r>
+      <w:r>
+        <w:rPr>
+          <w:rFonts w:eastAsiaTheme="minorEastAsia"/>
+          <w:rtl/>
+        </w:rPr>
+        <w:t xml:space="preserve"> (بهترین گزینه‌ی </w:t>
+      </w:r>
+      <w:r>
+        <w:rPr>
+          <w:rFonts w:eastAsiaTheme="minorEastAsia"/>
+        </w:rPr>
+        <w:t>Min</w:t>
+      </w:r>
+      <w:r>
+        <w:rPr>
+          <w:rFonts w:eastAsiaTheme="minorEastAsia"/>
+          <w:rtl/>
+        </w:rPr>
+        <w:t>) را نگه می‌دارد. وقتی در یک گره</w:t>
+      </w:r>
+      <w:r>
+        <w:rPr>
+          <w:rFonts w:eastAsiaTheme="minorEastAsia"/>
+        </w:rPr>
+        <w:t xml:space="preserve">  </w:t>
+      </w:r>
+      <w:r>
+        <w:rPr>
+          <w:rFonts w:eastAsiaTheme="minorEastAsia"/>
+          <w:rtl/>
+        </w:rPr>
+        <w:t xml:space="preserve"> </w:t>
+      </w:r>
+      <w:r>
+        <w:rPr>
+          <w:rFonts w:eastAsiaTheme="minorEastAsia"/>
+        </w:rPr>
+        <w:t>α ≥ β</w:t>
+      </w:r>
+      <w:r>
+        <w:rPr>
+          <w:rFonts w:eastAsiaTheme="minorEastAsia"/>
+          <w:rtl/>
+        </w:rPr>
+        <w:t xml:space="preserve"> شود، یعنی طرف مقابل در سطح بالاتر درخت، از قبل گزینه‌ای بهتر از هر چیزی که این شاخه می‌تواند بدهد در اختیار دارد</w:t>
+      </w:r>
+      <w:r>
+        <w:rPr>
+          <w:rFonts w:eastAsiaTheme="minorEastAsia" w:hint="cs"/>
+          <w:rtl/>
+        </w:rPr>
+        <w:t xml:space="preserve">؛ </w:t>
+      </w:r>
+      <w:r>
+        <w:rPr>
+          <w:rFonts w:eastAsiaTheme="minorEastAsia" w:hint="cs"/>
+          <w:rtl/>
+        </w:rPr>
+        <w:t>پس</w:t>
+      </w:r>
+      <w:r>
+        <w:rPr>
+          <w:rFonts w:eastAsiaTheme="minorEastAsia"/>
+          <w:rtl/>
+        </w:rPr>
+        <w:t xml:space="preserve"> </w:t>
+      </w:r>
+      <w:r>
+        <w:rPr>
+          <w:rFonts w:eastAsiaTheme="minorEastAsia" w:hint="cs"/>
+          <w:rtl/>
+        </w:rPr>
+        <w:t>ادامه‌</w:t>
+      </w:r>
+      <w:r>
+        <w:rPr>
+          <w:rFonts w:eastAsiaTheme="minorEastAsia"/>
+          <w:rtl/>
+        </w:rPr>
+        <w:t xml:space="preserve">ی کاوش این شاخه هیچ اثری روی تصمیم نهایی نمی‌گذارد و می‌توان آن را کنار گذاشت. مزیت این کار صرفاً کارایی است، نه دقت بیشتر: </w:t>
+      </w:r>
+      <w:r>
+        <w:rPr>
+          <w:rFonts w:eastAsiaTheme="minorEastAsia"/>
+        </w:rPr>
+        <w:t>Minimax</w:t>
+      </w:r>
+      <w:r>
+        <w:rPr>
+          <w:rFonts w:eastAsiaTheme="minorEastAsia"/>
+          <w:rtl/>
+        </w:rPr>
+        <w:t xml:space="preserve"> خودش هم بهینه است، </w:t>
+      </w:r>
+      <w:r>
+        <w:rPr>
+          <w:rFonts w:eastAsiaTheme="minorEastAsia"/>
+        </w:rPr>
+        <w:t>Alpha-Beta</w:t>
+      </w:r>
+      <w:r>
+        <w:rPr>
+          <w:rFonts w:eastAsiaTheme="minorEastAsia"/>
+          <w:rtl/>
+        </w:rPr>
+        <w:t xml:space="preserve"> فقط با دیدن کمتر، به همان جواب می‌رسد.</w:t>
+      </w:r>
+      <w:r>
+        <w:rPr>
+          <w:rFonts w:eastAsiaTheme="minorEastAsia"/>
+          <w:rtl/>
+        </w:rPr>
+        <w:br/>
+      </w:r>
+      <w:r>
+        <w:rPr>
+          <w:rFonts w:eastAsiaTheme="minorEastAsia"/>
+          <w:rtl/>
+        </w:rPr>
+        <w:t xml:space="preserve">این ادعا با تست </w:t>
+      </w:r>
+      <w:r>
+        <w:rPr>
+          <w:rFonts w:eastAsiaTheme="minorEastAsia"/>
+        </w:rPr>
+        <w:t>correctness</w:t>
+      </w:r>
+      <w:r>
+        <w:rPr>
+          <w:rFonts w:eastAsiaTheme="minorEastAsia"/>
+          <w:rtl/>
+        </w:rPr>
+        <w:t xml:space="preserve"> که در بنچمارک اجرا شد هم تایید شد </w:t>
+      </w:r>
+      <w:r>
+        <w:rPr>
+          <w:rFonts w:ascii="Times New Roman" w:eastAsiaTheme="minorEastAsia" w:hAnsi="Times New Roman" w:cs="Times New Roman" w:hint="cs"/>
+          <w:rtl/>
+        </w:rPr>
+        <w:t>—</w:t>
+      </w:r>
+      <w:r>
+        <w:rPr>
+          <w:rFonts w:eastAsiaTheme="minorEastAsia"/>
+          <w:rtl/>
+        </w:rPr>
+        <w:t xml:space="preserve"> </w:t>
+      </w:r>
+      <w:r>
+        <w:rPr>
+          <w:rFonts w:eastAsiaTheme="minorEastAsia" w:hint="cs"/>
+          <w:rtl/>
+        </w:rPr>
+        <w:t>رو</w:t>
+      </w:r>
+      <w:r>
+        <w:rPr>
+          <w:rFonts w:eastAsiaTheme="minorEastAsia"/>
+          <w:rtl/>
+        </w:rPr>
+        <w:t xml:space="preserve">ی عمق‌های ۲ تا ۵، امتیاز </w:t>
+      </w:r>
+      <w:r>
+        <w:rPr>
+          <w:rFonts w:eastAsiaTheme="minorEastAsia"/>
+        </w:rPr>
+        <w:t>Alpha-Beta</w:t>
+      </w:r>
+      <w:r>
+        <w:rPr>
+          <w:rFonts w:eastAsiaTheme="minorEastAsia"/>
+          <w:rtl/>
+        </w:rPr>
+        <w:t xml:space="preserve"> و </w:t>
+      </w:r>
+      <w:r>
+        <w:rPr>
+          <w:rFonts w:eastAsiaTheme="minorEastAsia"/>
+        </w:rPr>
+        <w:t>Minimax</w:t>
+      </w:r>
+      <w:r>
+        <w:rPr>
+          <w:rFonts w:eastAsiaTheme="minorEastAsia"/>
+          <w:rtl/>
+        </w:rPr>
+        <w:t xml:space="preserve"> در همه‌ی موارد برابر بود (</w:t>
+      </w:r>
+      <w:r>
+        <w:rPr>
+          <w:rFonts w:eastAsiaTheme="minorEastAsia"/>
+        </w:rPr>
+        <w:t>match? YES</w:t>
+      </w:r>
+      <w:r>
+        <w:rPr>
+          <w:rFonts w:eastAsiaTheme="minorEastAsia"/>
+          <w:rtl/>
+        </w:rPr>
+        <w:t>)</w:t>
+      </w:r>
+      <w:r>
+        <w:rPr>
+          <w:rFonts w:eastAsiaTheme="minorEastAsia" w:hint="cs"/>
+          <w:rtl/>
+        </w:rPr>
+        <w:t>:</w:t>
+      </w:r>
+      <w:r>
+        <w:rPr>
+          <w:rFonts w:eastAsiaTheme="minorEastAsia"/>
+          <w:rtl/>
+        </w:rPr>
+        <w:br/>
+      </w:r>
+      <w:r>
+        <w:rPr>
+          <w:rFonts w:eastAsiaTheme="minorEastAsia"/>
+          <w:noProof/>
+          <w:rtl/>
+        </w:rPr>
         <w:lastRenderedPageBreak/>
-        <w:t>Alpha-Beta</w:t>
-      </w:r>
-      <w:r>
-        <w:rPr>
-          <w:rFonts w:eastAsiaTheme="minorEastAsia"/>
-          <w:rtl/>
-        </w:rPr>
-        <w:t xml:space="preserve"> همان درخت تصمیمی را که </w:t>
-      </w:r>
-      <w:r>
-        <w:rPr>
-          <w:rFonts w:eastAsiaTheme="minorEastAsia"/>
-        </w:rPr>
-        <w:t>Minimax</w:t>
-      </w:r>
-      <w:r>
-        <w:rPr>
-          <w:rFonts w:eastAsiaTheme="minorEastAsia"/>
-          <w:rtl/>
-        </w:rPr>
-        <w:t xml:space="preserve"> می‌بیند بررسی می‌کند، با این تفاوت که در حین جست‌وجو دو مقدار </w:t>
-      </w:r>
-      <w:r>
-        <w:rPr>
-          <w:rFonts w:eastAsiaTheme="minorEastAsia"/>
-        </w:rPr>
-        <w:t>α</w:t>
-      </w:r>
-      <w:r>
-        <w:rPr>
-          <w:rFonts w:eastAsiaTheme="minorEastAsia"/>
-          <w:rtl/>
-        </w:rPr>
-        <w:t xml:space="preserve"> (بهترین گزینه‌ی</w:t>
-      </w:r>
-      <w:r>
-        <w:rPr>
-          <w:rFonts w:eastAsiaTheme="minorEastAsia" w:hint="cs"/>
-          <w:rtl/>
-        </w:rPr>
-        <w:t xml:space="preserve"> </w:t>
-      </w:r>
-      <w:r>
-        <w:rPr>
-          <w:rFonts w:eastAsiaTheme="minorEastAsia"/>
-        </w:rPr>
-        <w:t>Max</w:t>
-      </w:r>
-      <w:r>
-        <w:rPr>
-          <w:rFonts w:eastAsiaTheme="minorEastAsia"/>
-          <w:rtl/>
-        </w:rPr>
-        <w:t xml:space="preserve">) و </w:t>
-      </w:r>
-      <w:r>
-        <w:rPr>
-          <w:rFonts w:eastAsiaTheme="minorEastAsia"/>
-        </w:rPr>
-        <w:t>β</w:t>
-      </w:r>
-      <w:r>
-        <w:rPr>
-          <w:rFonts w:eastAsiaTheme="minorEastAsia"/>
-          <w:rtl/>
-        </w:rPr>
-        <w:t xml:space="preserve"> (بهترین گزینه‌ی </w:t>
-      </w:r>
-      <w:r>
-        <w:rPr>
-          <w:rFonts w:eastAsiaTheme="minorEastAsia"/>
-        </w:rPr>
-        <w:t>Min</w:t>
-      </w:r>
-      <w:r>
-        <w:rPr>
-          <w:rFonts w:eastAsiaTheme="minorEastAsia"/>
-          <w:rtl/>
-        </w:rPr>
-        <w:t>) را نگه می‌دارد. وقتی در یک گره</w:t>
-      </w:r>
-      <w:r>
-        <w:rPr>
-          <w:rFonts w:eastAsiaTheme="minorEastAsia"/>
-        </w:rPr>
-        <w:t xml:space="preserve">  </w:t>
-      </w:r>
-      <w:r>
-        <w:rPr>
-          <w:rFonts w:eastAsiaTheme="minorEastAsia"/>
-          <w:rtl/>
-        </w:rPr>
-        <w:t xml:space="preserve"> </w:t>
-      </w:r>
-      <w:r>
-        <w:rPr>
-          <w:rFonts w:eastAsiaTheme="minorEastAsia"/>
-        </w:rPr>
-        <w:t>α ≥ β</w:t>
-      </w:r>
-      <w:r>
-        <w:rPr>
-          <w:rFonts w:eastAsiaTheme="minorEastAsia"/>
-          <w:rtl/>
-        </w:rPr>
-        <w:t xml:space="preserve"> شود، یعنی طرف مقابل در سطح بالاتر درخت، از قبل گزینه‌ای بهتر از هر چیزی که این شاخه می‌تواند بدهد در اختیار دارد</w:t>
-      </w:r>
-      <w:r>
-        <w:rPr>
-          <w:rFonts w:eastAsiaTheme="minorEastAsia" w:hint="cs"/>
-          <w:rtl/>
-        </w:rPr>
-        <w:t xml:space="preserve">؛ </w:t>
-      </w:r>
-      <w:r>
-        <w:rPr>
-          <w:rFonts w:eastAsiaTheme="minorEastAsia" w:hint="cs"/>
-          <w:rtl/>
-        </w:rPr>
-        <w:t>پس</w:t>
-      </w:r>
-      <w:r>
-        <w:rPr>
-          <w:rFonts w:eastAsiaTheme="minorEastAsia"/>
-          <w:rtl/>
-        </w:rPr>
-        <w:t xml:space="preserve"> </w:t>
-      </w:r>
-      <w:r>
-        <w:rPr>
-          <w:rFonts w:eastAsiaTheme="minorEastAsia" w:hint="cs"/>
-          <w:rtl/>
-        </w:rPr>
-        <w:t>ادامه‌</w:t>
-      </w:r>
-      <w:r>
-        <w:rPr>
-          <w:rFonts w:eastAsiaTheme="minorEastAsia"/>
-          <w:rtl/>
-        </w:rPr>
-        <w:t xml:space="preserve">ی کاوش این شاخه هیچ اثری روی تصمیم نهایی نمی‌گذارد و می‌توان آن را کنار گذاشت. مزیت این کار صرفاً کارایی است، نه دقت بیشتر: </w:t>
-      </w:r>
-      <w:r>
-        <w:rPr>
-          <w:rFonts w:eastAsiaTheme="minorEastAsia"/>
-        </w:rPr>
-        <w:t>Minimax</w:t>
-      </w:r>
-      <w:r>
-        <w:rPr>
-          <w:rFonts w:eastAsiaTheme="minorEastAsia"/>
-          <w:rtl/>
-        </w:rPr>
-        <w:t xml:space="preserve"> خودش هم بهینه است، </w:t>
-      </w:r>
-      <w:r>
-        <w:rPr>
-          <w:rFonts w:eastAsiaTheme="minorEastAsia"/>
-        </w:rPr>
-        <w:t>Alpha-Beta</w:t>
-      </w:r>
-      <w:r>
-        <w:rPr>
-          <w:rFonts w:eastAsiaTheme="minorEastAsia"/>
-          <w:rtl/>
-        </w:rPr>
-        <w:t xml:space="preserve"> فقط با دیدن کمتر، به همان جواب می‌رسد.</w:t>
-      </w:r>
-      <w:r>
-        <w:rPr>
-          <w:rFonts w:eastAsiaTheme="minorEastAsia"/>
-          <w:rtl/>
-        </w:rPr>
-        <w:br/>
-      </w:r>
-      <w:r>
-        <w:rPr>
-          <w:rFonts w:eastAsiaTheme="minorEastAsia"/>
-          <w:rtl/>
-        </w:rPr>
-        <w:t xml:space="preserve">این ادعا با تست </w:t>
-      </w:r>
-      <w:r>
-        <w:rPr>
-          <w:rFonts w:eastAsiaTheme="minorEastAsia"/>
-        </w:rPr>
-        <w:t>correctness</w:t>
-      </w:r>
-      <w:r>
-        <w:rPr>
-          <w:rFonts w:eastAsiaTheme="minorEastAsia"/>
-          <w:rtl/>
-        </w:rPr>
-        <w:t xml:space="preserve"> که در بنچمارک اجرا شد هم تایید شد </w:t>
-      </w:r>
-      <w:r>
-        <w:rPr>
-          <w:rFonts w:ascii="Times New Roman" w:eastAsiaTheme="minorEastAsia" w:hAnsi="Times New Roman" w:cs="Times New Roman" w:hint="cs"/>
-          <w:rtl/>
-        </w:rPr>
-        <w:t>—</w:t>
-      </w:r>
-      <w:r>
-        <w:rPr>
-          <w:rFonts w:eastAsiaTheme="minorEastAsia"/>
-          <w:rtl/>
-        </w:rPr>
-        <w:t xml:space="preserve"> </w:t>
-      </w:r>
-      <w:r>
-        <w:rPr>
-          <w:rFonts w:eastAsiaTheme="minorEastAsia" w:hint="cs"/>
-          <w:rtl/>
-        </w:rPr>
-        <w:t>رو</w:t>
-      </w:r>
-      <w:r>
-        <w:rPr>
-          <w:rFonts w:eastAsiaTheme="minorEastAsia"/>
-          <w:rtl/>
-        </w:rPr>
-        <w:t xml:space="preserve">ی عمق‌های ۲ تا ۵، امتیاز </w:t>
-      </w:r>
-      <w:r>
-        <w:rPr>
-          <w:rFonts w:eastAsiaTheme="minorEastAsia"/>
-        </w:rPr>
-        <w:t>Alpha-Beta</w:t>
-      </w:r>
-      <w:r>
-        <w:rPr>
-          <w:rFonts w:eastAsiaTheme="minorEastAsia"/>
-          <w:rtl/>
-        </w:rPr>
-        <w:t xml:space="preserve"> و </w:t>
-      </w:r>
-      <w:r>
-        <w:rPr>
-          <w:rFonts w:eastAsiaTheme="minorEastAsia"/>
-        </w:rPr>
-        <w:t>Minimax</w:t>
-      </w:r>
-      <w:r>
-        <w:rPr>
-          <w:rFonts w:eastAsiaTheme="minorEastAsia"/>
-          <w:rtl/>
-        </w:rPr>
-        <w:t xml:space="preserve"> در همه‌ی موارد برابر بود (</w:t>
-      </w:r>
-      <w:r>
-        <w:rPr>
-          <w:rFonts w:eastAsiaTheme="minorEastAsia"/>
-        </w:rPr>
-        <w:t>match? YES</w:t>
-      </w:r>
-      <w:r>
-        <w:rPr>
-          <w:rFonts w:eastAsiaTheme="minorEastAsia"/>
-          <w:rtl/>
-        </w:rPr>
-        <w:t>)</w:t>
-      </w:r>
-      <w:r>
-        <w:rPr>
-          <w:rFonts w:eastAsiaTheme="minorEastAsia" w:hint="cs"/>
-          <w:rtl/>
-        </w:rPr>
-        <w:t>:</w:t>
-      </w:r>
-      <w:r>
-        <w:rPr>
-          <w:rFonts w:eastAsiaTheme="minorEastAsia"/>
-          <w:rtl/>
-        </w:rPr>
-        <w:br/>
-      </w:r>
-      <w:r>
-        <w:rPr>
-          <w:rFonts w:eastAsiaTheme="minorEastAsia"/>
-          <w:rtl/>
-        </w:rPr>
         <w:drawing>
           <wp:inline distT="0" distB="0" distL="0" distR="0" wp14:anchorId="6696C558" wp14:editId="7F2BECB6">
             <wp:extent cx="6085490" cy="1393401"/>
@@ -7491,6 +8028,7 @@
       <w:r>
         <w:rPr>
           <w:rFonts w:eastAsiaTheme="minorEastAsia"/>
+          <w:noProof/>
           <w:rtl/>
         </w:rPr>
         <w:drawing>
@@ -7555,97 +8093,98 @@
           <w:rFonts w:eastAsiaTheme="minorEastAsia"/>
           <w:rtl/>
         </w:rPr>
+        <w:t>فضای جست‌وجو آن‌قدر کوچک است</w:t>
+      </w:r>
+      <w:r>
+        <w:rPr>
+          <w:rFonts w:eastAsiaTheme="minorEastAsia" w:hint="cs"/>
+          <w:rtl/>
+        </w:rPr>
+        <w:t xml:space="preserve"> </w:t>
+      </w:r>
+      <w:r>
+        <w:rPr>
+          <w:rFonts w:eastAsiaTheme="minorEastAsia"/>
+          <w:rtl/>
+        </w:rPr>
+        <w:t>که فرصتی برای هرس واقعی وجود ندارد</w:t>
+      </w:r>
+      <w:r>
+        <w:rPr>
+          <w:rFonts w:eastAsiaTheme="minorEastAsia" w:hint="cs"/>
+          <w:rtl/>
+        </w:rPr>
+        <w:t xml:space="preserve">؛ اما با افزایش عمق، </w:t>
+      </w:r>
+      <w:r>
+        <w:rPr>
+          <w:rFonts w:eastAsiaTheme="minorEastAsia"/>
+          <w:rtl/>
+        </w:rPr>
+        <w:t>اثر</w:t>
+      </w:r>
+      <w:r>
+        <w:rPr>
+          <w:rFonts w:eastAsiaTheme="minorEastAsia" w:hint="cs"/>
+          <w:rtl/>
+        </w:rPr>
+        <w:t xml:space="preserve"> جمعی</w:t>
+      </w:r>
+      <w:r>
+        <w:rPr>
+          <w:rFonts w:eastAsiaTheme="minorEastAsia"/>
+          <w:rtl/>
+        </w:rPr>
+        <w:t xml:space="preserve"> مرتب‌سازی</w:t>
+      </w:r>
+      <w:r>
+        <w:rPr>
+          <w:rFonts w:eastAsiaTheme="minorEastAsia" w:hint="cs"/>
+          <w:rtl/>
+        </w:rPr>
+        <w:t xml:space="preserve"> </w:t>
+      </w:r>
+      <w:r>
+        <w:rPr>
+          <w:rFonts w:eastAsiaTheme="minorEastAsia"/>
+          <w:rtl/>
+        </w:rPr>
+        <w:t>درست بیشتر خودش را نشان می‌دهد و در عمق ۷ به ۱۱.۸</w:t>
+      </w:r>
+      <w:r>
+        <w:rPr>
+          <w:rFonts w:ascii="Times New Roman" w:eastAsiaTheme="minorEastAsia" w:hAnsi="Times New Roman" w:cs="Times New Roman" w:hint="cs"/>
+          <w:rtl/>
+        </w:rPr>
+        <w:t>٪</w:t>
+      </w:r>
+      <w:r>
+        <w:rPr>
+          <w:rFonts w:eastAsiaTheme="minorEastAsia"/>
+          <w:rtl/>
+        </w:rPr>
+        <w:t xml:space="preserve"> کاهش گره می‌رسیم</w:t>
+      </w:r>
+      <w:r>
+        <w:rPr>
+          <w:rFonts w:eastAsiaTheme="minorEastAsia"/>
+        </w:rPr>
+        <w:t>.</w:t>
+      </w:r>
+      <w:r>
+        <w:rPr>
+          <w:rFonts w:eastAsiaTheme="minorEastAsia"/>
+          <w:rtl/>
+        </w:rPr>
+        <w:br/>
+      </w:r>
+      <w:r>
+        <w:rPr>
+          <w:rFonts w:eastAsiaTheme="minorEastAsia"/>
+          <w:noProof/>
+          <w:rtl/>
+        </w:rPr>
         <w:lastRenderedPageBreak/>
-        <w:t>فضای جست‌وجو آن‌قدر کوچک است</w:t>
-      </w:r>
-      <w:r>
-        <w:rPr>
-          <w:rFonts w:eastAsiaTheme="minorEastAsia" w:hint="cs"/>
-          <w:rtl/>
-        </w:rPr>
-        <w:t xml:space="preserve"> </w:t>
-      </w:r>
-      <w:r>
-        <w:rPr>
-          <w:rFonts w:eastAsiaTheme="minorEastAsia"/>
-          <w:rtl/>
-        </w:rPr>
-        <w:t>که فرصتی برای هرس واقعی وجود ندارد</w:t>
-      </w:r>
-      <w:r>
-        <w:rPr>
-          <w:rFonts w:eastAsiaTheme="minorEastAsia" w:hint="cs"/>
-          <w:rtl/>
-        </w:rPr>
-        <w:t xml:space="preserve">؛ اما با افزایش عمق، </w:t>
-      </w:r>
-      <w:r>
-        <w:rPr>
-          <w:rFonts w:eastAsiaTheme="minorEastAsia"/>
-          <w:rtl/>
-        </w:rPr>
-        <w:t>اثر</w:t>
-      </w:r>
-      <w:r>
-        <w:rPr>
-          <w:rFonts w:eastAsiaTheme="minorEastAsia" w:hint="cs"/>
-          <w:rtl/>
-        </w:rPr>
-        <w:t xml:space="preserve"> جمعی</w:t>
-      </w:r>
-      <w:r>
-        <w:rPr>
-          <w:rFonts w:eastAsiaTheme="minorEastAsia"/>
-          <w:rtl/>
-        </w:rPr>
-        <w:t xml:space="preserve"> مرتب‌سازی</w:t>
-      </w:r>
-      <w:r>
-        <w:rPr>
-          <w:rFonts w:eastAsiaTheme="minorEastAsia" w:hint="cs"/>
-          <w:rtl/>
-        </w:rPr>
-        <w:t xml:space="preserve"> </w:t>
-      </w:r>
-      <w:r>
-        <w:rPr>
-          <w:rFonts w:eastAsiaTheme="minorEastAsia"/>
-          <w:rtl/>
-        </w:rPr>
-        <w:t>درست بیشتر خودش را نشان می‌دهد و در عمق ۷ به ۱۱.۸</w:t>
-      </w:r>
-      <w:r>
-        <w:rPr>
-          <w:rFonts w:ascii="Times New Roman" w:eastAsiaTheme="minorEastAsia" w:hAnsi="Times New Roman" w:cs="Times New Roman" w:hint="cs"/>
-          <w:rtl/>
-        </w:rPr>
-        <w:t>٪</w:t>
-      </w:r>
-      <w:r>
-        <w:rPr>
-          <w:rFonts w:eastAsiaTheme="minorEastAsia"/>
-          <w:rtl/>
-        </w:rPr>
-        <w:t xml:space="preserve"> کاهش گره می‌رسیم</w:t>
-      </w:r>
-      <w:r>
-        <w:rPr>
-          <w:rFonts w:eastAsiaTheme="minorEastAsia"/>
-        </w:rPr>
-        <w:t>.</w:t>
-      </w:r>
-      <w:r>
-        <w:rPr>
-          <w:rFonts w:eastAsiaTheme="minorEastAsia"/>
-          <w:rtl/>
-        </w:rPr>
-        <w:br/>
-      </w:r>
-      <w:r>
-        <w:rPr>
-          <w:rFonts w:eastAsiaTheme="minorEastAsia"/>
-          <w:rtl/>
-        </w:rPr>
         <w:drawing>
           <wp:inline distT="0" distB="0" distL="0" distR="0" wp14:anchorId="631BCC66" wp14:editId="282DB2F2">
             <wp:extent cx="6051973" cy="2467197"/>
@@ -9149,47 +9688,40 @@
           <w:rFonts w:eastAsiaTheme="minorEastAsia"/>
           <w:rtl/>
         </w:rPr>
-        <w:t xml:space="preserve">، بهترین را انتخاب می‌کند. الگوریتم </w:t>
-      </w:r>
-      <w:r>
-        <w:rPr>
-          <w:rFonts w:eastAsiaTheme="minorEastAsia"/>
-          <w:rtl/>
+        <w:t xml:space="preserve">، بهترین را انتخاب می‌کند. الگوریتم اکشن مشخصی مثل «اگر </w:t>
+      </w:r>
+      <w:r>
+        <w:rPr>
+          <w:rFonts w:eastAsiaTheme="minorEastAsia"/>
+        </w:rPr>
+        <w:t>HP</w:t>
+      </w:r>
+      <w:r>
+        <w:rPr>
+          <w:rFonts w:eastAsiaTheme="minorEastAsia"/>
+          <w:rtl/>
+        </w:rPr>
+        <w:t xml:space="preserve"> کم بود حمله کن» را به‌صورت قانون ثابت (</w:t>
+      </w:r>
+      <w:r>
+        <w:rPr>
+          <w:rFonts w:eastAsiaTheme="minorEastAsia"/>
+        </w:rPr>
+        <w:t>rule</w:t>
+      </w:r>
+      <w:r>
+        <w:rPr>
+          <w:rFonts w:eastAsiaTheme="minorEastAsia"/>
+          <w:rtl/>
+        </w:rPr>
+        <w:t xml:space="preserve">) کدنویسی نکرده؛ در عوض، هر اکشن قانونی را امتحان می‌کند، حالت بعد از آن را با جست‌وجو تا چند گام جلوتر شبیه‌سازی می‌کند، </w:t>
+      </w:r>
+      <w:proofErr w:type="spellStart"/>
+      <w:r>
+        <w:rPr>
+          <w:rFonts w:eastAsiaTheme="minorEastAsia"/>
         </w:rPr>
         <w:lastRenderedPageBreak/>
-        <w:t xml:space="preserve">اکشن مشخصی مثل «اگر </w:t>
-      </w:r>
-      <w:r>
-        <w:rPr>
-          <w:rFonts w:eastAsiaTheme="minorEastAsia"/>
-        </w:rPr>
-        <w:t>HP</w:t>
-      </w:r>
-      <w:r>
-        <w:rPr>
-          <w:rFonts w:eastAsiaTheme="minorEastAsia"/>
-          <w:rtl/>
-        </w:rPr>
-        <w:t xml:space="preserve"> کم بود حمله کن» را به‌صورت قانون ثابت (</w:t>
-      </w:r>
-      <w:r>
-        <w:rPr>
-          <w:rFonts w:eastAsiaTheme="minorEastAsia"/>
-        </w:rPr>
-        <w:t>rule</w:t>
-      </w:r>
-      <w:r>
-        <w:rPr>
-          <w:rFonts w:eastAsiaTheme="minorEastAsia"/>
-          <w:rtl/>
-        </w:rPr>
-        <w:t xml:space="preserve">) کدنویسی نکرده؛ در عوض، هر اکشن قانونی را امتحان می‌کند، حالت بعد از آن را با جست‌وجو تا چند گام جلوتر شبیه‌سازی می‌کند، </w:t>
-      </w:r>
-      <w:proofErr w:type="spellStart"/>
-      <w:r>
-        <w:rPr>
-          <w:rFonts w:eastAsiaTheme="minorEastAsia"/>
-        </w:rPr>
         <w:t>evaluate_enemy</w:t>
       </w:r>
       <w:proofErr w:type="spellEnd"/>

</xml_diff>